<commit_message>
update the en pdf
</commit_message>
<xml_diff>
--- a/Switch-tutorial.docx
+++ b/Switch-tutorial.docx
@@ -657,7 +657,7 @@
                 <w:noProof/>
                 <w:webHidden/>
               </w:rPr>
-              <w:t>10</w:t>
+              <w:t>11</w:t>
             </w:r>
             <w:r>
               <w:rPr>
@@ -832,7 +832,7 @@
                 <w:noProof/>
                 <w:webHidden/>
               </w:rPr>
-              <w:t>12</w:t>
+              <w:t>17</w:t>
             </w:r>
             <w:r>
               <w:rPr>
@@ -923,7 +923,7 @@
                 <w:noProof/>
                 <w:webHidden/>
               </w:rPr>
-              <w:t>14</w:t>
+              <w:t>19</w:t>
             </w:r>
             <w:r>
               <w:rPr>
@@ -1014,7 +1014,7 @@
                 <w:noProof/>
                 <w:webHidden/>
               </w:rPr>
-              <w:t>16</w:t>
+              <w:t>13</w:t>
             </w:r>
             <w:r>
               <w:rPr>
@@ -1105,7 +1105,7 @@
                 <w:noProof/>
                 <w:webHidden/>
               </w:rPr>
-              <w:t>19</w:t>
+              <w:t>15</w:t>
             </w:r>
             <w:r>
               <w:rPr>
@@ -1198,7 +1198,15 @@
     </w:p>
     <w:p>
       <w:r>
-        <w:t xml:space="preserve">Utiliser une console moddée pour jouer à des copies de jeux peut violer les </w:t>
+        <w:t xml:space="preserve">Utiliser une console </w:t>
+      </w:r>
+      <w:proofErr w:type="spellStart"/>
+      <w:r>
+        <w:t>moddée</w:t>
+      </w:r>
+      <w:proofErr w:type="spellEnd"/>
+      <w:r>
+        <w:t xml:space="preserve"> pour jouer à des copies de jeux peut violer les </w:t>
       </w:r>
       <w:r>
         <w:rPr>
@@ -1220,8 +1228,13 @@
       <w:r>
         <w:t xml:space="preserve">. </w:t>
       </w:r>
-      <w:r>
-        <w:t>Utilisez les donc avec éthique et n’hésitez pas à acheter les jeux officiels Nintendo afin de rémunérer les créateurs de ces jeux</w:t>
+      <w:proofErr w:type="gramStart"/>
+      <w:r>
+        <w:t>Utilisez les</w:t>
+      </w:r>
+      <w:proofErr w:type="gramEnd"/>
+      <w:r>
+        <w:t xml:space="preserve"> donc avec éthique et n’hésitez pas à acheter les jeux officiels Nintendo afin de rémunérer les créateurs de ces jeux</w:t>
       </w:r>
       <w:r>
         <w:t xml:space="preserve">. Le piratage de contenu artistique n’est pas éthique, et peut être puni par la loi. </w:t>
@@ -1229,7 +1242,15 @@
     </w:p>
     <w:p>
       <w:r>
-        <w:t xml:space="preserve">Il est important de faire des sauvegardes régulièrement de ses jeux lorsque l’on possède une console moddée, puisque tout le système d’exploitation utilise la carte SD et pas la mémoire interne de la console. Elle subit donc de l’usure plus rapidement, ce qui sur le long terme peut mener à la mort de la carte SD. Une fois la carte SD morte, il est impossible de récupérer ses sauvegardes. Utilisez donc une carte SD de qualité afin de ne pas avoir de mauvaises surprises. </w:t>
+        <w:t xml:space="preserve">Il est important de faire des sauvegardes régulièrement de ses jeux lorsque l’on possède une console </w:t>
+      </w:r>
+      <w:proofErr w:type="spellStart"/>
+      <w:r>
+        <w:t>moddée</w:t>
+      </w:r>
+      <w:proofErr w:type="spellEnd"/>
+      <w:r>
+        <w:t xml:space="preserve">, puisque tout le système d’exploitation utilise la carte SD et pas la mémoire interne de la console. Elle subit donc de l’usure plus rapidement, ce qui sur le long terme peut mener à la mort de la carte SD. Une fois la carte SD morte, il est impossible de récupérer ses sauvegardes. Utilisez donc une carte SD de qualité afin de ne pas avoir de mauvaises surprises. </w:t>
       </w:r>
     </w:p>
     <w:p/>
@@ -1314,7 +1335,23 @@
           <w:b/>
           <w:bCs/>
         </w:rPr>
-        <w:t xml:space="preserve">Est-ce que je peux encore jouer en ligne après avoir hacké ma console ? </w:t>
+        <w:t xml:space="preserve">Est-ce que je peux encore jouer en ligne après avoir </w:t>
+      </w:r>
+      <w:proofErr w:type="spellStart"/>
+      <w:r>
+        <w:rPr>
+          <w:b/>
+          <w:bCs/>
+        </w:rPr>
+        <w:t>hacké</w:t>
+      </w:r>
+      <w:proofErr w:type="spellEnd"/>
+      <w:r>
+        <w:rPr>
+          <w:b/>
+          <w:bCs/>
+        </w:rPr>
+        <w:t xml:space="preserve"> ma console ? </w:t>
       </w:r>
     </w:p>
     <w:p>
@@ -1335,7 +1372,23 @@
           <w:b/>
           <w:bCs/>
         </w:rPr>
-        <w:t xml:space="preserve">Est-ce que je peux me faire bannir si je joue en EmuMMC à des jeux piratés ? </w:t>
+        <w:t xml:space="preserve">Est-ce que je peux me faire bannir si je joue en </w:t>
+      </w:r>
+      <w:proofErr w:type="spellStart"/>
+      <w:r>
+        <w:rPr>
+          <w:b/>
+          <w:bCs/>
+        </w:rPr>
+        <w:t>EmuMMC</w:t>
+      </w:r>
+      <w:proofErr w:type="spellEnd"/>
+      <w:r>
+        <w:rPr>
+          <w:b/>
+          <w:bCs/>
+        </w:rPr>
+        <w:t xml:space="preserve"> à des jeux piratés ? </w:t>
       </w:r>
     </w:p>
     <w:p>
@@ -1356,7 +1409,23 @@
           <w:b/>
           <w:bCs/>
         </w:rPr>
-        <w:t>Qu’est ce que ma console risque ?</w:t>
+        <w:t>Qu’</w:t>
+      </w:r>
+      <w:proofErr w:type="spellStart"/>
+      <w:r>
+        <w:rPr>
+          <w:b/>
+          <w:bCs/>
+        </w:rPr>
+        <w:t>est ce</w:t>
+      </w:r>
+      <w:proofErr w:type="spellEnd"/>
+      <w:r>
+        <w:rPr>
+          <w:b/>
+          <w:bCs/>
+        </w:rPr>
+        <w:t xml:space="preserve"> que ma console risque ?</w:t>
       </w:r>
     </w:p>
     <w:p>
@@ -1377,7 +1446,23 @@
           <w:b/>
           <w:bCs/>
         </w:rPr>
-        <w:t xml:space="preserve">Combien de temps l’installation prend elle ? </w:t>
+        <w:t xml:space="preserve">Combien de temps l’installation </w:t>
+      </w:r>
+      <w:proofErr w:type="spellStart"/>
+      <w:r>
+        <w:rPr>
+          <w:b/>
+          <w:bCs/>
+        </w:rPr>
+        <w:t>prend elle</w:t>
+      </w:r>
+      <w:proofErr w:type="spellEnd"/>
+      <w:r>
+        <w:rPr>
+          <w:b/>
+          <w:bCs/>
+        </w:rPr>
+        <w:t xml:space="preserve"> ? </w:t>
       </w:r>
     </w:p>
     <w:p>
@@ -1440,7 +1525,23 @@
     <w:p>
       <w:r>
         <w:tab/>
-        <w:t xml:space="preserve">Je suis un profiteur de la communauté, je n’ai pas développé le hack moi-même et je mets à profit des gens mes capacités en microsoudure. J’ai une vingtaine de consoles de moddées de passif, et je n’ai eu aucun échec jusque là. </w:t>
+        <w:t xml:space="preserve">Je suis un profiteur de la communauté, je n’ai pas développé le hack moi-même et je mets à profit des gens mes capacités en microsoudure. J’ai une vingtaine de consoles de </w:t>
+      </w:r>
+      <w:proofErr w:type="spellStart"/>
+      <w:r>
+        <w:t>moddées</w:t>
+      </w:r>
+      <w:proofErr w:type="spellEnd"/>
+      <w:r>
+        <w:t xml:space="preserve"> de passif, et je n’ai eu aucun échec </w:t>
+      </w:r>
+      <w:proofErr w:type="spellStart"/>
+      <w:r>
+        <w:t>jusque là</w:t>
+      </w:r>
+      <w:proofErr w:type="spellEnd"/>
+      <w:r>
+        <w:t xml:space="preserve">. </w:t>
       </w:r>
     </w:p>
     <w:p>
@@ -1500,7 +1601,15 @@
         <w:t xml:space="preserve">Les weekends et quelques jours de la semaine, à voir au cas par cas. </w:t>
       </w:r>
       <w:r>
-        <w:t xml:space="preserve">Pour plus d’infos, rendez vous sur </w:t>
+        <w:t xml:space="preserve">Pour plus d’infos, </w:t>
+      </w:r>
+      <w:proofErr w:type="spellStart"/>
+      <w:r>
+        <w:t>rendez vous</w:t>
+      </w:r>
+      <w:proofErr w:type="spellEnd"/>
+      <w:r>
+        <w:t xml:space="preserve"> sur </w:t>
       </w:r>
       <w:hyperlink r:id="rId9" w:history="1">
         <w:r>
@@ -1521,18 +1630,35 @@
           <w:bCs/>
         </w:rPr>
       </w:pPr>
-      <w:r>
-        <w:rPr>
-          <w:b/>
-          <w:bCs/>
-        </w:rPr>
-        <w:t xml:space="preserve">Possédez vous des consoles que je peux acheter directement ? </w:t>
+      <w:proofErr w:type="spellStart"/>
+      <w:r>
+        <w:rPr>
+          <w:b/>
+          <w:bCs/>
+        </w:rPr>
+        <w:t>Possédez vous</w:t>
+      </w:r>
+      <w:proofErr w:type="spellEnd"/>
+      <w:r>
+        <w:rPr>
+          <w:b/>
+          <w:bCs/>
+        </w:rPr>
+        <w:t xml:space="preserve"> des consoles que je peux acheter directement ? </w:t>
       </w:r>
     </w:p>
     <w:p>
       <w:r>
         <w:tab/>
-        <w:t xml:space="preserve">Oui j’ai des Nintendo switch lite hackées que je vends au prix de 140-160€ unité. </w:t>
+        <w:t xml:space="preserve">Oui j’ai des Nintendo switch lite </w:t>
+      </w:r>
+      <w:proofErr w:type="spellStart"/>
+      <w:r>
+        <w:t>hackées</w:t>
+      </w:r>
+      <w:proofErr w:type="spellEnd"/>
+      <w:r>
+        <w:t xml:space="preserve"> que je vends au prix de 140-160€ unité. </w:t>
       </w:r>
     </w:p>
     <w:p>
@@ -1554,7 +1680,10 @@
     <w:p>
       <w:r>
         <w:tab/>
-        <w:t xml:space="preserve">Oui si vous voulez avoir une garantie, vous pouvez sélectionner ce que vous voulez dans les options. 15€ supplémentaires pour la switch lite et la normale, et 20€ supplémentaires pour une switch Oled. </w:t>
+        <w:t xml:space="preserve">Oui si vous voulez avoir une garantie, vous pouvez sélectionner ce que vous voulez dans les options. </w:t>
+      </w:r>
+      <w:r>
+        <w:t xml:space="preserve">Il suffit de cocher l’option « Garantie » dans les choix sur le sélecteur de prix </w:t>
       </w:r>
     </w:p>
     <w:p>
@@ -1575,7 +1704,23 @@
     <w:p>
       <w:r>
         <w:tab/>
-        <w:t xml:space="preserve">Sur base de la loi sur les droits d'auteur en Belgique, les pirates informatiques risquent une amende allant de 550 à 550.000 euros et/ou une peine de prison de 3 mois à 3 ans. (source : belga) </w:t>
+        <w:t>Sur base de la loi sur les droits d'auteur en Belgique, les pirates informatiques risquent une amende allant de 550 à 550.000 euros et/ou une peine de prison de 3 mois à 3 ans. (</w:t>
+      </w:r>
+      <w:proofErr w:type="gramStart"/>
+      <w:r>
+        <w:t>source</w:t>
+      </w:r>
+      <w:proofErr w:type="gramEnd"/>
+      <w:r>
+        <w:t xml:space="preserve"> : </w:t>
+      </w:r>
+      <w:proofErr w:type="spellStart"/>
+      <w:r>
+        <w:t>belga</w:t>
+      </w:r>
+      <w:proofErr w:type="spellEnd"/>
+      <w:r>
+        <w:t xml:space="preserve">) </w:t>
       </w:r>
     </w:p>
     <w:p>
@@ -1626,7 +1771,27 @@
           <w:sz w:val="36"/>
           <w:szCs w:val="36"/>
         </w:rPr>
-        <w:t xml:space="preserve"> Qu’est ce que sont les différents modes de boot</w:t>
+        <w:t xml:space="preserve"> Qu’</w:t>
+      </w:r>
+      <w:proofErr w:type="spellStart"/>
+      <w:r>
+        <w:rPr>
+          <w:b/>
+          <w:bCs/>
+          <w:sz w:val="36"/>
+          <w:szCs w:val="36"/>
+        </w:rPr>
+        <w:t>est ce</w:t>
+      </w:r>
+      <w:proofErr w:type="spellEnd"/>
+      <w:r>
+        <w:rPr>
+          <w:b/>
+          <w:bCs/>
+          <w:sz w:val="36"/>
+          <w:szCs w:val="36"/>
+        </w:rPr>
+        <w:t xml:space="preserve"> que sont les différents modes de boot</w:t>
       </w:r>
       <w:r>
         <w:rPr>
@@ -1674,6 +1839,7 @@
       <w:r>
         <w:t xml:space="preserve">Le mode </w:t>
       </w:r>
+      <w:proofErr w:type="spellStart"/>
       <w:r>
         <w:rPr>
           <w:b/>
@@ -1688,6 +1854,7 @@
         </w:rPr>
         <w:t>MMC</w:t>
       </w:r>
+      <w:proofErr w:type="spellEnd"/>
       <w:r>
         <w:t xml:space="preserve"> est une console virtuelle dont la mémoire interne est sur la carte SD. Il permet de simuler une fausse console afin de passer inaperçu face aux serveurs de Nintendo, et ainsi éviter un bannissement.</w:t>
       </w:r>
@@ -1706,6 +1873,7 @@
       <w:r>
         <w:t xml:space="preserve">Le mode </w:t>
       </w:r>
+      <w:proofErr w:type="spellStart"/>
       <w:r>
         <w:rPr>
           <w:b/>
@@ -1720,6 +1888,7 @@
         </w:rPr>
         <w:t>MMC</w:t>
       </w:r>
+      <w:proofErr w:type="spellEnd"/>
       <w:r>
         <w:t xml:space="preserve"> </w:t>
       </w:r>
@@ -1756,7 +1925,55 @@
           <w:b/>
           <w:bCs/>
         </w:rPr>
-        <w:t xml:space="preserve">C’est pourquoi il est normal que si vous faites des progrès sur un jeu sur SysMMC, le progrès ne sera pas reflété sur votre sauvegarde en EmuMMC. </w:t>
+        <w:t xml:space="preserve">C’est pourquoi il est normal que si vous </w:t>
+      </w:r>
+      <w:proofErr w:type="gramStart"/>
+      <w:r>
+        <w:rPr>
+          <w:b/>
+          <w:bCs/>
+        </w:rPr>
+        <w:t>faites des progrès</w:t>
+      </w:r>
+      <w:proofErr w:type="gramEnd"/>
+      <w:r>
+        <w:rPr>
+          <w:b/>
+          <w:bCs/>
+        </w:rPr>
+        <w:t xml:space="preserve"> sur un jeu sur </w:t>
+      </w:r>
+      <w:proofErr w:type="spellStart"/>
+      <w:r>
+        <w:rPr>
+          <w:b/>
+          <w:bCs/>
+        </w:rPr>
+        <w:t>SysMMC</w:t>
+      </w:r>
+      <w:proofErr w:type="spellEnd"/>
+      <w:r>
+        <w:rPr>
+          <w:b/>
+          <w:bCs/>
+        </w:rPr>
+        <w:t xml:space="preserve">, le progrès ne sera pas reflété sur votre sauvegarde en </w:t>
+      </w:r>
+      <w:proofErr w:type="spellStart"/>
+      <w:r>
+        <w:rPr>
+          <w:b/>
+          <w:bCs/>
+        </w:rPr>
+        <w:t>EmuMMC</w:t>
+      </w:r>
+      <w:proofErr w:type="spellEnd"/>
+      <w:r>
+        <w:rPr>
+          <w:b/>
+          <w:bCs/>
+        </w:rPr>
+        <w:t xml:space="preserve">. </w:t>
       </w:r>
       <w:r>
         <w:rPr>
@@ -1782,20 +1999,85 @@
           <w:b/>
           <w:bCs/>
         </w:rPr>
-        <w:t xml:space="preserve">Système d’exploitation </w:t>
-      </w:r>
-      <w:r>
-        <w:t xml:space="preserve"> n’est pas géré par cela, et c’est pourquoi il existe une troisième option : </w:t>
-      </w:r>
-      <w:r>
-        <w:rPr>
-          <w:b/>
-          <w:bCs/>
-        </w:rPr>
-        <w:t>CFW (sysmmc)</w:t>
-      </w:r>
-      <w:r>
-        <w:t xml:space="preserve"> qui permet à l’utilisateur de rentrer dans la mémoire interne de la console ( Sysmmc ) et pouvoir se servir de programmes personnalisés ( comme Tinfoil pour «Dump » ses jeux (récupérer le jeu sous forme de ROM que l’on peut retélécharger par la suite))</w:t>
+        <w:t xml:space="preserve">Système </w:t>
+      </w:r>
+      <w:proofErr w:type="gramStart"/>
+      <w:r>
+        <w:rPr>
+          <w:b/>
+          <w:bCs/>
+        </w:rPr>
+        <w:t xml:space="preserve">d’exploitation </w:t>
+      </w:r>
+      <w:r>
+        <w:t xml:space="preserve"> n’est</w:t>
+      </w:r>
+      <w:proofErr w:type="gramEnd"/>
+      <w:r>
+        <w:t xml:space="preserve"> pas géré par cela, et c’est pourquoi il existe une troisième option : </w:t>
+      </w:r>
+      <w:r>
+        <w:rPr>
+          <w:b/>
+          <w:bCs/>
+        </w:rPr>
+        <w:t>CFW (</w:t>
+      </w:r>
+      <w:proofErr w:type="spellStart"/>
+      <w:r>
+        <w:rPr>
+          <w:b/>
+          <w:bCs/>
+        </w:rPr>
+        <w:t>sysmmc</w:t>
+      </w:r>
+      <w:proofErr w:type="spellEnd"/>
+      <w:r>
+        <w:rPr>
+          <w:b/>
+          <w:bCs/>
+        </w:rPr>
+        <w:t>)</w:t>
+      </w:r>
+      <w:r>
+        <w:t xml:space="preserve"> qui permet à l’utilisateur de rentrer dans la mémoire interne de la console </w:t>
+      </w:r>
+      <w:proofErr w:type="gramStart"/>
+      <w:r>
+        <w:t xml:space="preserve">( </w:t>
+      </w:r>
+      <w:proofErr w:type="spellStart"/>
+      <w:r>
+        <w:t>Sysmmc</w:t>
+      </w:r>
+      <w:proofErr w:type="spellEnd"/>
+      <w:proofErr w:type="gramEnd"/>
+      <w:r>
+        <w:t xml:space="preserve"> ) et pouvoir se servir de programmes personnalisés </w:t>
+      </w:r>
+      <w:proofErr w:type="gramStart"/>
+      <w:r>
+        <w:t>( comme</w:t>
+      </w:r>
+      <w:proofErr w:type="gramEnd"/>
+      <w:r>
+        <w:t xml:space="preserve"> </w:t>
+      </w:r>
+      <w:proofErr w:type="spellStart"/>
+      <w:r>
+        <w:t>Tinfoil</w:t>
+      </w:r>
+      <w:proofErr w:type="spellEnd"/>
+      <w:r>
+        <w:t xml:space="preserve"> pour</w:t>
+      </w:r>
+      <w:proofErr w:type="gramStart"/>
+      <w:r>
+        <w:t xml:space="preserve"> «Dump</w:t>
+      </w:r>
+      <w:proofErr w:type="gramEnd"/>
+      <w:r>
+        <w:t> » ses jeux (récupérer le jeu sous forme de ROM que l’on peut retélécharger par la suite))</w:t>
       </w:r>
       <w:r>
         <w:t>. Mais</w:t>
@@ -1808,7 +2090,28 @@
         <w:t xml:space="preserve"> ce mode de démarrage est plutôt risqué</w:t>
       </w:r>
       <w:r>
-        <w:t>, car un faux mouvement ( on installe un jeu que l’on ne possède pas sur SysMMC ) peut rendre la console bannie</w:t>
+        <w:t xml:space="preserve">, car un faux mouvement </w:t>
+      </w:r>
+      <w:proofErr w:type="gramStart"/>
+      <w:r>
+        <w:t>( on</w:t>
+      </w:r>
+      <w:proofErr w:type="gramEnd"/>
+      <w:r>
+        <w:t xml:space="preserve"> installe un jeu que l’on ne possède pas sur </w:t>
+      </w:r>
+      <w:proofErr w:type="spellStart"/>
+      <w:proofErr w:type="gramStart"/>
+      <w:r>
+        <w:t>SysMMC</w:t>
+      </w:r>
+      <w:proofErr w:type="spellEnd"/>
+      <w:r>
+        <w:t xml:space="preserve"> )</w:t>
+      </w:r>
+      <w:proofErr w:type="gramEnd"/>
+      <w:r>
+        <w:t xml:space="preserve"> peut rendre la console bannie</w:t>
       </w:r>
       <w:r>
         <w:t xml:space="preserve"> </w:t>
@@ -1831,11 +2134,21 @@
       <w:r>
         <w:t xml:space="preserve">Le système d’exploitation de la console de base, on l’appelle NX OS. Le </w:t>
       </w:r>
-      <w:r>
-        <w:t xml:space="preserve">firmware </w:t>
-      </w:r>
-      <w:r>
-        <w:t xml:space="preserve"> personnalisé qui permet de lancer des applications personnalisées s’appelle </w:t>
+      <w:proofErr w:type="spellStart"/>
+      <w:proofErr w:type="gramStart"/>
+      <w:r>
+        <w:t>firmware</w:t>
+      </w:r>
+      <w:proofErr w:type="spellEnd"/>
+      <w:r>
+        <w:t xml:space="preserve"> </w:t>
+      </w:r>
+      <w:r>
+        <w:t xml:space="preserve"> personnalisé</w:t>
+      </w:r>
+      <w:proofErr w:type="gramEnd"/>
+      <w:r>
+        <w:t xml:space="preserve"> qui permet de lancer des applications personnalisées s’appelle </w:t>
       </w:r>
       <w:r>
         <w:rPr>
@@ -1845,7 +2158,23 @@
         <w:t>Atmosphère</w:t>
       </w:r>
       <w:r>
-        <w:t xml:space="preserve"> et est composé de plusieurs couches qui ont chacune un rôle spécifique ( par exemple rendre la console incognito, démarrer des jeux, etc… ) </w:t>
+        <w:t xml:space="preserve"> et est composé de plusieurs couches qui ont chacune un rôle spécifique </w:t>
+      </w:r>
+      <w:proofErr w:type="gramStart"/>
+      <w:r>
+        <w:t>( par</w:t>
+      </w:r>
+      <w:proofErr w:type="gramEnd"/>
+      <w:r>
+        <w:t xml:space="preserve"> exemple rendre la console incognito, démarrer des jeux, etc</w:t>
+      </w:r>
+      <w:proofErr w:type="gramStart"/>
+      <w:r>
+        <w:t>… )</w:t>
+      </w:r>
+      <w:proofErr w:type="gramEnd"/>
+      <w:r>
+        <w:t xml:space="preserve"> </w:t>
       </w:r>
       <w:r>
         <w:br/>
@@ -1860,8 +2189,17 @@
         </w:numPr>
       </w:pPr>
       <w:r>
-        <w:t xml:space="preserve">Il est important de ne pas confondre système d’exploitation et firmware. </w:t>
-      </w:r>
+        <w:t xml:space="preserve">Il est important de ne pas confondre système d’exploitation et </w:t>
+      </w:r>
+      <w:proofErr w:type="spellStart"/>
+      <w:r>
+        <w:t>firmware</w:t>
+      </w:r>
+      <w:proofErr w:type="spellEnd"/>
+      <w:r>
+        <w:t xml:space="preserve">. </w:t>
+      </w:r>
+      <w:proofErr w:type="spellStart"/>
       <w:r>
         <w:rPr>
           <w:b/>
@@ -1869,6 +2207,7 @@
         </w:rPr>
         <w:t>Firmware</w:t>
       </w:r>
+      <w:proofErr w:type="spellEnd"/>
       <w:r>
         <w:t xml:space="preserve"> se réfère donc bien à Atmosphère et </w:t>
       </w:r>
@@ -1880,7 +2219,15 @@
         <w:t>Système d’exploitation</w:t>
       </w:r>
       <w:r>
-        <w:t xml:space="preserve"> se réfère à NX OS. Les deux sont indépendants mais il est nécessaire de mettre les deux à jour en même temps, et commencer d’abord par mettre à jour Atmosphère avant NX OS. </w:t>
+        <w:t xml:space="preserve"> se réfère à NX OS. Les deux sont indépendants mais il est nécessaire de mettre les deux à jour en même temps, et </w:t>
+      </w:r>
+      <w:proofErr w:type="gramStart"/>
+      <w:r>
+        <w:t>commencer d’abord</w:t>
+      </w:r>
+      <w:proofErr w:type="gramEnd"/>
+      <w:r>
+        <w:t xml:space="preserve"> par mettre à jour Atmosphère avant NX OS. </w:t>
       </w:r>
     </w:p>
     <w:p>
@@ -1928,7 +2275,47 @@
           <w:sz w:val="36"/>
           <w:szCs w:val="36"/>
         </w:rPr>
-        <w:t xml:space="preserve"> Démarrer la console en mode moddé (EmuMMC)</w:t>
+        <w:t xml:space="preserve"> Démarrer la console en mode </w:t>
+      </w:r>
+      <w:proofErr w:type="spellStart"/>
+      <w:r>
+        <w:rPr>
+          <w:b/>
+          <w:bCs/>
+          <w:sz w:val="36"/>
+          <w:szCs w:val="36"/>
+        </w:rPr>
+        <w:t>moddé</w:t>
+      </w:r>
+      <w:proofErr w:type="spellEnd"/>
+      <w:r>
+        <w:rPr>
+          <w:b/>
+          <w:bCs/>
+          <w:sz w:val="36"/>
+          <w:szCs w:val="36"/>
+        </w:rPr>
+        <w:t xml:space="preserve"> (</w:t>
+      </w:r>
+      <w:proofErr w:type="spellStart"/>
+      <w:r>
+        <w:rPr>
+          <w:b/>
+          <w:bCs/>
+          <w:sz w:val="36"/>
+          <w:szCs w:val="36"/>
+        </w:rPr>
+        <w:t>EmuMMC</w:t>
+      </w:r>
+      <w:proofErr w:type="spellEnd"/>
+      <w:r>
+        <w:rPr>
+          <w:b/>
+          <w:bCs/>
+          <w:sz w:val="36"/>
+          <w:szCs w:val="36"/>
+        </w:rPr>
+        <w:t>)</w:t>
       </w:r>
     </w:p>
     <w:p>
@@ -1946,7 +2333,23 @@
         <w:t>Allumez la console</w:t>
       </w:r>
       <w:r>
-        <w:t xml:space="preserve"> via un jig + RCM loader ou via un dongle injecteur</w:t>
+        <w:t xml:space="preserve"> via un </w:t>
+      </w:r>
+      <w:proofErr w:type="spellStart"/>
+      <w:r>
+        <w:t>jig</w:t>
+      </w:r>
+      <w:proofErr w:type="spellEnd"/>
+      <w:r>
+        <w:t xml:space="preserve"> + RCM loader ou via un </w:t>
+      </w:r>
+      <w:proofErr w:type="spellStart"/>
+      <w:r>
+        <w:t>dongle</w:t>
+      </w:r>
+      <w:proofErr w:type="spellEnd"/>
+      <w:r>
+        <w:t xml:space="preserve"> injecteur</w:t>
       </w:r>
       <w:r>
         <w:t>, si vous n’avez pas de puce</w:t>
@@ -1955,7 +2358,31 @@
         <w:t>.</w:t>
       </w:r>
       <w:r>
-        <w:t xml:space="preserve"> Allumez la console normalement si vous avez une puce. ( NOTE : le démarrage peut prendre jusqu’à 25 secondes, soyez donc un peu patient, et n’appuyez pas à répétition sur le bonton POWER ) </w:t>
+        <w:t xml:space="preserve"> Allumez la console normalement si vous avez une puce. </w:t>
+      </w:r>
+      <w:proofErr w:type="gramStart"/>
+      <w:r>
+        <w:t>( NOTE</w:t>
+      </w:r>
+      <w:proofErr w:type="gramEnd"/>
+      <w:r>
+        <w:t xml:space="preserve"> : le démarrage peut prendre jusqu’à 25 secondes, soyez donc un peu patient, et n’appuyez pas à répétition sur le </w:t>
+      </w:r>
+      <w:proofErr w:type="spellStart"/>
+      <w:r>
+        <w:t>bonton</w:t>
+      </w:r>
+      <w:proofErr w:type="spellEnd"/>
+      <w:r>
+        <w:t xml:space="preserve"> </w:t>
+      </w:r>
+      <w:proofErr w:type="gramStart"/>
+      <w:r>
+        <w:t>POWER )</w:t>
+      </w:r>
+      <w:proofErr w:type="gramEnd"/>
+      <w:r>
+        <w:t xml:space="preserve"> </w:t>
       </w:r>
     </w:p>
     <w:p>
@@ -1983,13 +2410,55 @@
           <w:b/>
           <w:bCs/>
         </w:rPr>
-        <w:t>"EmuMMC"</w:t>
-      </w:r>
-      <w:r>
-        <w:t xml:space="preserve"> (émulation de mémoire système) dans le menu Hekate</w:t>
-      </w:r>
-      <w:r>
-        <w:t xml:space="preserve"> ( Launch -&gt; EmuMMC ) </w:t>
+        <w:t>"</w:t>
+      </w:r>
+      <w:proofErr w:type="spellStart"/>
+      <w:r>
+        <w:rPr>
+          <w:b/>
+          <w:bCs/>
+        </w:rPr>
+        <w:t>EmuMMC</w:t>
+      </w:r>
+      <w:proofErr w:type="spellEnd"/>
+      <w:r>
+        <w:rPr>
+          <w:b/>
+          <w:bCs/>
+        </w:rPr>
+        <w:t>"</w:t>
+      </w:r>
+      <w:r>
+        <w:t xml:space="preserve"> (émulation de mémoire système) dans le menu </w:t>
+      </w:r>
+      <w:proofErr w:type="spellStart"/>
+      <w:r>
+        <w:t>Hekate</w:t>
+      </w:r>
+      <w:proofErr w:type="spellEnd"/>
+      <w:r>
+        <w:t xml:space="preserve"> </w:t>
+      </w:r>
+      <w:proofErr w:type="gramStart"/>
+      <w:r>
+        <w:t>( Launch</w:t>
+      </w:r>
+      <w:proofErr w:type="gramEnd"/>
+      <w:r>
+        <w:t xml:space="preserve"> -&gt; </w:t>
+      </w:r>
+      <w:proofErr w:type="spellStart"/>
+      <w:proofErr w:type="gramStart"/>
+      <w:r>
+        <w:t>EmuMMC</w:t>
+      </w:r>
+      <w:proofErr w:type="spellEnd"/>
+      <w:r>
+        <w:t xml:space="preserve"> )</w:t>
+      </w:r>
+      <w:proofErr w:type="gramEnd"/>
+      <w:r>
+        <w:t xml:space="preserve"> </w:t>
       </w:r>
       <w:r>
         <w:t>.</w:t>
@@ -2082,7 +2551,15 @@
         <w:t>Allumez la console</w:t>
       </w:r>
       <w:r>
-        <w:t xml:space="preserve"> en appuyant sur le bouton Volume + et le bouton volume – en même temps, et gardez les enfoncés durant l’entièreté du processus de boot de la console.</w:t>
+        <w:t xml:space="preserve"> en appuyant sur le bouton Volume + et le bouton volume – en même temps, et </w:t>
+      </w:r>
+      <w:proofErr w:type="gramStart"/>
+      <w:r>
+        <w:t>gardez les</w:t>
+      </w:r>
+      <w:proofErr w:type="gramEnd"/>
+      <w:r>
+        <w:t xml:space="preserve"> enfoncés durant l’entièreté du processus de boot de la console.</w:t>
       </w:r>
     </w:p>
     <w:p>
@@ -2116,8 +2593,19 @@
           <w:sz w:val="36"/>
           <w:szCs w:val="36"/>
         </w:rPr>
-        <w:t xml:space="preserve"> Démarrer la console en mode Hekate</w:t>
-      </w:r>
+        <w:t xml:space="preserve"> Démarrer la console en mode </w:t>
+      </w:r>
+      <w:proofErr w:type="spellStart"/>
+      <w:r>
+        <w:rPr>
+          <w:b/>
+          <w:bCs/>
+          <w:sz w:val="36"/>
+          <w:szCs w:val="36"/>
+        </w:rPr>
+        <w:t>Hekate</w:t>
+      </w:r>
+      <w:proofErr w:type="spellEnd"/>
     </w:p>
     <w:p>
       <w:pPr>
@@ -2134,7 +2622,15 @@
         <w:t>Allumez la console</w:t>
       </w:r>
       <w:r>
-        <w:t xml:space="preserve"> avec le bouton power, et en même temps appuyez sur le bouton « Volume - », après quelques secondes, le menu Hekate devrait apparaître</w:t>
+        <w:t xml:space="preserve"> avec le bouton power, et en même temps appuyez sur le bouton « Volume - », après quelques secondes, le menu </w:t>
+      </w:r>
+      <w:proofErr w:type="spellStart"/>
+      <w:r>
+        <w:t>Hekate</w:t>
+      </w:r>
+      <w:proofErr w:type="spellEnd"/>
+      <w:r>
+        <w:t xml:space="preserve"> devrait apparaître</w:t>
       </w:r>
     </w:p>
     <w:p>
@@ -2208,6 +2704,7 @@
           <w:numId w:val="2"/>
         </w:numPr>
       </w:pPr>
+      <w:proofErr w:type="spellStart"/>
       <w:r>
         <w:rPr>
           <w:b/>
@@ -2215,8 +2712,17 @@
         </w:rPr>
         <w:t>Daybreak</w:t>
       </w:r>
-      <w:r>
-        <w:t xml:space="preserve"> = Mise à jour manuelle du firmware (uniquement si nécessaire).</w:t>
+      <w:proofErr w:type="spellEnd"/>
+      <w:r>
+        <w:t xml:space="preserve"> = Mise à jour manuelle du </w:t>
+      </w:r>
+      <w:proofErr w:type="spellStart"/>
+      <w:r>
+        <w:t>firmware</w:t>
+      </w:r>
+      <w:proofErr w:type="spellEnd"/>
+      <w:r>
+        <w:t xml:space="preserve"> (uniquement si nécessaire).</w:t>
       </w:r>
     </w:p>
     <w:p>
@@ -2311,7 +2817,27 @@
           <w:sz w:val="36"/>
           <w:szCs w:val="36"/>
         </w:rPr>
-        <w:t xml:space="preserve"> Installer des jeux via Tinfoil </w:t>
+        <w:t xml:space="preserve"> Installer des jeux via </w:t>
+      </w:r>
+      <w:proofErr w:type="spellStart"/>
+      <w:r>
+        <w:rPr>
+          <w:b/>
+          <w:bCs/>
+          <w:sz w:val="36"/>
+          <w:szCs w:val="36"/>
+        </w:rPr>
+        <w:t>Tinfoil</w:t>
+      </w:r>
+      <w:proofErr w:type="spellEnd"/>
+      <w:r>
+        <w:rPr>
+          <w:b/>
+          <w:bCs/>
+          <w:sz w:val="36"/>
+          <w:szCs w:val="36"/>
+        </w:rPr>
+        <w:t xml:space="preserve"> </w:t>
       </w:r>
       <w:bookmarkEnd w:id="5"/>
     </w:p>
@@ -2327,8 +2853,17 @@
           <w:b/>
           <w:bCs/>
         </w:rPr>
-        <w:t>Étape 1 : Ouvrir Tinfoil</w:t>
-      </w:r>
+        <w:t xml:space="preserve">Étape 1 : Ouvrir </w:t>
+      </w:r>
+      <w:proofErr w:type="spellStart"/>
+      <w:r>
+        <w:rPr>
+          <w:b/>
+          <w:bCs/>
+        </w:rPr>
+        <w:t>Tinfoil</w:t>
+      </w:r>
+      <w:proofErr w:type="spellEnd"/>
     </w:p>
     <w:p>
       <w:pPr>
@@ -2340,6 +2875,7 @@
       <w:r>
         <w:t xml:space="preserve">Lancez </w:t>
       </w:r>
+      <w:proofErr w:type="spellStart"/>
       <w:r>
         <w:rPr>
           <w:b/>
@@ -2347,11 +2883,20 @@
         </w:rPr>
         <w:t>Tinfoil</w:t>
       </w:r>
+      <w:proofErr w:type="spellEnd"/>
       <w:r>
         <w:t xml:space="preserve"> depuis l</w:t>
       </w:r>
       <w:r>
-        <w:t xml:space="preserve">e jeu Tinfoil (le démarrage peut prendre un peu de temps, entre 1 et </w:t>
+        <w:t xml:space="preserve">e jeu </w:t>
+      </w:r>
+      <w:proofErr w:type="spellStart"/>
+      <w:r>
+        <w:t>Tinfoil</w:t>
+      </w:r>
+      <w:proofErr w:type="spellEnd"/>
+      <w:r>
+        <w:t xml:space="preserve"> (le démarrage peut prendre un peu de temps, entre 1 et </w:t>
       </w:r>
       <w:r>
         <w:t>5 minutes en fonction de la connexion réseau).</w:t>
@@ -2360,11 +2905,21 @@
         <w:br/>
       </w:r>
       <w:r>
-        <w:t xml:space="preserve">Tant qu’il est mis « Loading  </w:t>
+        <w:t>Tant qu’il est mis « </w:t>
+      </w:r>
+      <w:proofErr w:type="spellStart"/>
+      <w:proofErr w:type="gramStart"/>
+      <w:r>
+        <w:t>Loading</w:t>
+      </w:r>
+      <w:proofErr w:type="spellEnd"/>
+      <w:r>
+        <w:t xml:space="preserve">  </w:t>
       </w:r>
       <w:r>
         <w:t>-</w:t>
       </w:r>
+      <w:proofErr w:type="gramEnd"/>
       <w:r>
         <w:t>quelque chose</w:t>
       </w:r>
@@ -2375,7 +2930,63 @@
         <w:t>, c’est bon.</w:t>
       </w:r>
       <w:r>
-        <w:t xml:space="preserve"> Au démarrage il peut y avoir un popup « would you like to install this game cartridge » , que vous pouvez ignorer (« cancel »), c’est uniquement pour installer les cartouches que vous possédez.   </w:t>
+        <w:t xml:space="preserve"> Au démarrage il peut y avoir un popup « </w:t>
+      </w:r>
+      <w:proofErr w:type="spellStart"/>
+      <w:r>
+        <w:t>would</w:t>
+      </w:r>
+      <w:proofErr w:type="spellEnd"/>
+      <w:r>
+        <w:t xml:space="preserve"> </w:t>
+      </w:r>
+      <w:proofErr w:type="spellStart"/>
+      <w:r>
+        <w:t>you</w:t>
+      </w:r>
+      <w:proofErr w:type="spellEnd"/>
+      <w:r>
+        <w:t xml:space="preserve"> like to </w:t>
+      </w:r>
+      <w:proofErr w:type="spellStart"/>
+      <w:r>
+        <w:t>install</w:t>
+      </w:r>
+      <w:proofErr w:type="spellEnd"/>
+      <w:r>
+        <w:t xml:space="preserve"> </w:t>
+      </w:r>
+      <w:proofErr w:type="spellStart"/>
+      <w:r>
+        <w:t>this</w:t>
+      </w:r>
+      <w:proofErr w:type="spellEnd"/>
+      <w:r>
+        <w:t xml:space="preserve"> </w:t>
+      </w:r>
+      <w:proofErr w:type="spellStart"/>
+      <w:r>
+        <w:t>game</w:t>
+      </w:r>
+      <w:proofErr w:type="spellEnd"/>
+      <w:r>
+        <w:t xml:space="preserve"> </w:t>
+      </w:r>
+      <w:proofErr w:type="spellStart"/>
+      <w:r>
+        <w:t>cartridge</w:t>
+      </w:r>
+      <w:proofErr w:type="spellEnd"/>
+      <w:r>
+        <w:t> </w:t>
+      </w:r>
+      <w:proofErr w:type="gramStart"/>
+      <w:r>
+        <w:t>» ,</w:t>
+      </w:r>
+      <w:proofErr w:type="gramEnd"/>
+      <w:r>
+        <w:t xml:space="preserve"> que vous pouvez ignorer (« cancel »), c’est uniquement pour installer les cartouches que vous possédez.   </w:t>
       </w:r>
       <w:r>
         <w:br/>
@@ -2442,7 +3053,15 @@
         </w:numPr>
       </w:pPr>
       <w:r>
-        <w:t>Si Tinfoil ne démarre pas :</w:t>
+        <w:t xml:space="preserve">Si </w:t>
+      </w:r>
+      <w:proofErr w:type="spellStart"/>
+      <w:r>
+        <w:t>Tinfoil</w:t>
+      </w:r>
+      <w:proofErr w:type="spellEnd"/>
+      <w:r>
+        <w:t xml:space="preserve"> ne démarre pas :</w:t>
       </w:r>
     </w:p>
     <w:p>
@@ -2463,7 +3082,15 @@
         <w:t>USBFS</w:t>
       </w:r>
       <w:r>
-        <w:t xml:space="preserve"> est activé (depuis les options de Tinfoil).</w:t>
+        <w:t xml:space="preserve"> est activé (depuis les options de </w:t>
+      </w:r>
+      <w:proofErr w:type="spellStart"/>
+      <w:r>
+        <w:t>Tinfoil</w:t>
+      </w:r>
+      <w:proofErr w:type="spellEnd"/>
+      <w:r>
+        <w:t>).</w:t>
       </w:r>
     </w:p>
     <w:p>
@@ -2474,7 +3101,15 @@
         </w:numPr>
       </w:pPr>
       <w:r>
-        <w:t>Mettez à jour Tinfoil via un homebrew shop ou manuellement.</w:t>
+        <w:t xml:space="preserve">Mettez à jour </w:t>
+      </w:r>
+      <w:proofErr w:type="spellStart"/>
+      <w:r>
+        <w:t>Tinfoil</w:t>
+      </w:r>
+      <w:proofErr w:type="spellEnd"/>
+      <w:r>
+        <w:t xml:space="preserve"> via un homebrew shop ou manuellement.</w:t>
       </w:r>
     </w:p>
     <w:p>
@@ -2517,13 +3152,45 @@
           <w:b/>
           <w:bCs/>
         </w:rPr>
-        <w:t>"Browse"</w:t>
+        <w:t>"</w:t>
+      </w:r>
+      <w:proofErr w:type="spellStart"/>
+      <w:r>
+        <w:rPr>
+          <w:b/>
+          <w:bCs/>
+        </w:rPr>
+        <w:t>Browse</w:t>
+      </w:r>
+      <w:proofErr w:type="spellEnd"/>
+      <w:r>
+        <w:rPr>
+          <w:b/>
+          <w:bCs/>
+        </w:rPr>
+        <w:t>"</w:t>
       </w:r>
       <w:r>
         <w:t>.</w:t>
       </w:r>
       <w:r>
-        <w:t xml:space="preserve"> Si l’onglet « New games » n’est pas visible, contactez moi, cela veut dire que soit vous êtes hors ligne, soit que </w:t>
+        <w:t xml:space="preserve"> Si l’onglet « New </w:t>
+      </w:r>
+      <w:proofErr w:type="spellStart"/>
+      <w:r>
+        <w:t>games</w:t>
+      </w:r>
+      <w:proofErr w:type="spellEnd"/>
+      <w:r>
+        <w:t xml:space="preserve"> » n’est pas visible, </w:t>
+      </w:r>
+      <w:proofErr w:type="gramStart"/>
+      <w:r>
+        <w:t>contactez moi</w:t>
+      </w:r>
+      <w:proofErr w:type="gramEnd"/>
+      <w:r>
+        <w:t xml:space="preserve">, cela veut dire que soit vous êtes hors ligne, soit que </w:t>
       </w:r>
       <w:r>
         <w:t xml:space="preserve">le shop virtuel a disparu. </w:t>
@@ -2764,7 +3431,15 @@
         </w:numPr>
       </w:pPr>
       <w:r>
-        <w:t>Si vous voulez mettre vos jeux à jour, ce n’est plus faisable juste avec « mettre à jour » traditionnel, il faut donc passer par Tinfoil également</w:t>
+        <w:t xml:space="preserve">Si vous voulez mettre vos jeux à jour, ce n’est plus faisable juste avec « mettre à jour » traditionnel, il faut donc passer par </w:t>
+      </w:r>
+      <w:proofErr w:type="spellStart"/>
+      <w:r>
+        <w:t>Tinfoil</w:t>
+      </w:r>
+      <w:proofErr w:type="spellEnd"/>
+      <w:r>
+        <w:t xml:space="preserve"> également</w:t>
       </w:r>
       <w:r>
         <w:t>. Pour cela il suffit d’aller dans l’onglet « New updates » et cliquer sur le bouton x pour tout installer.   </w:t>
@@ -2905,9 +3580,20 @@
           <w:sz w:val="36"/>
           <w:szCs w:val="36"/>
         </w:rPr>
-        <w:t>Rajouter un shop Tinfoil</w:t>
+        <w:t xml:space="preserve">Rajouter un shop </w:t>
+      </w:r>
+      <w:proofErr w:type="spellStart"/>
+      <w:r>
+        <w:rPr>
+          <w:b/>
+          <w:bCs/>
+          <w:sz w:val="36"/>
+          <w:szCs w:val="36"/>
+        </w:rPr>
+        <w:t>Tinfoil</w:t>
       </w:r>
       <w:bookmarkEnd w:id="6"/>
+      <w:proofErr w:type="spellEnd"/>
       <w:r>
         <w:rPr>
           <w:b/>
@@ -2984,8 +3670,13 @@
         </w:rPr>
         <w:br/>
       </w:r>
-      <w:r>
-        <w:t>Protocol: https</w:t>
+      <w:proofErr w:type="gramStart"/>
+      <w:r>
+        <w:t>Protocol:</w:t>
+      </w:r>
+      <w:proofErr w:type="gramEnd"/>
+      <w:r>
+        <w:t xml:space="preserve"> https</w:t>
       </w:r>
     </w:p>
     <w:p>
@@ -3013,8 +3704,18 @@
         <w:rPr>
           <w:lang w:val="en-US"/>
         </w:rPr>
-        <w:t>Path: tinfoil.json</w:t>
-      </w:r>
+        <w:t xml:space="preserve">Path: </w:t>
+      </w:r>
+      <w:proofErr w:type="spellStart"/>
+      <w:proofErr w:type="gramStart"/>
+      <w:r>
+        <w:rPr>
+          <w:lang w:val="en-US"/>
+        </w:rPr>
+        <w:t>tinfoil.json</w:t>
+      </w:r>
+      <w:proofErr w:type="spellEnd"/>
+      <w:proofErr w:type="gramEnd"/>
     </w:p>
     <w:p>
       <w:pPr>
@@ -3268,7 +3969,15 @@
         </w:numPr>
       </w:pPr>
       <w:r>
-        <w:t xml:space="preserve">Compléter les champs avec les informations fournies . C’est intuitif, il faut appuyer sur A sur le champ que vous voulez modifier, ou utiliser le tactile de la console. </w:t>
+        <w:t xml:space="preserve">Compléter les champs avec les informations </w:t>
+      </w:r>
+      <w:proofErr w:type="gramStart"/>
+      <w:r>
+        <w:t>fournies .</w:t>
+      </w:r>
+      <w:proofErr w:type="gramEnd"/>
+      <w:r>
+        <w:t xml:space="preserve"> C’est intuitif, il faut appuyer sur A sur le champ que vous voulez modifier, ou utiliser le tactile de la console. </w:t>
       </w:r>
       <w:r>
         <w:br/>
@@ -3500,13 +4209,26 @@
         </w:rPr>
       </w:pPr>
       <w:r>
-        <w:t xml:space="preserve">Sélectionner l’option avec l’acronyme MTP dedans ( Media Transfer </w:t>
-      </w:r>
+        <w:t xml:space="preserve">Sélectionner l’option avec l’acronyme MTP dedans </w:t>
+      </w:r>
+      <w:proofErr w:type="gramStart"/>
+      <w:r>
+        <w:t>( Media</w:t>
+      </w:r>
+      <w:proofErr w:type="gramEnd"/>
+      <w:r>
+        <w:t xml:space="preserve"> Transfer </w:t>
+      </w:r>
+      <w:proofErr w:type="gramStart"/>
       <w:r>
         <w:t>P</w:t>
       </w:r>
       <w:r>
-        <w:t xml:space="preserve">rotocol ) </w:t>
+        <w:t>rotocol )</w:t>
+      </w:r>
+      <w:proofErr w:type="gramEnd"/>
+      <w:r>
+        <w:t xml:space="preserve"> </w:t>
       </w:r>
       <w:r>
         <w:br/>
@@ -3580,8 +4302,21 @@
         </w:rPr>
       </w:pPr>
       <w:r>
-        <w:t>Sélectionner l’option 5 : SD card install</w:t>
-      </w:r>
+        <w:t xml:space="preserve">Sélectionner l’option 5 : SD </w:t>
+      </w:r>
+      <w:proofErr w:type="spellStart"/>
+      <w:r>
+        <w:t>card</w:t>
+      </w:r>
+      <w:proofErr w:type="spellEnd"/>
+      <w:r>
+        <w:t xml:space="preserve"> </w:t>
+      </w:r>
+      <w:proofErr w:type="spellStart"/>
+      <w:r>
+        <w:t>install</w:t>
+      </w:r>
+      <w:proofErr w:type="spellEnd"/>
       <w:r>
         <w:br/>
       </w:r>
@@ -3698,12 +4433,28 @@
         <w:lastRenderedPageBreak/>
         <w:t xml:space="preserve">NOTES : Il se peut que vous ayez une erreur durant l’installation. </w:t>
       </w:r>
+      <w:proofErr w:type="spellStart"/>
       <w:r>
         <w:rPr>
           <w:lang w:val="en-US"/>
         </w:rPr>
-        <w:t>Voici la plus fréquente</w:t>
-      </w:r>
+        <w:t>Voici</w:t>
+      </w:r>
+      <w:proofErr w:type="spellEnd"/>
+      <w:r>
+        <w:rPr>
+          <w:lang w:val="en-US"/>
+        </w:rPr>
+        <w:t xml:space="preserve"> la plus </w:t>
+      </w:r>
+      <w:proofErr w:type="spellStart"/>
+      <w:r>
+        <w:rPr>
+          <w:lang w:val="en-US"/>
+        </w:rPr>
+        <w:t>fréquente</w:t>
+      </w:r>
+      <w:proofErr w:type="spellEnd"/>
       <w:r>
         <w:rPr>
           <w:noProof/>
@@ -3781,7 +4532,23 @@
         </w:rPr>
       </w:pPr>
       <w:r>
-        <w:t>Cela signifie que le transfert de fichiers était trop lent et que l’ordinateur a refusé de continuer. Il se pourrait que changer de câble USB-C répare le problème, mais la plupart du temps, il suffit de lancer DBI en mode « Non applet mode »( voir la section sur le « Applet mode »</w:t>
+        <w:t xml:space="preserve">Cela signifie que le transfert de fichiers était trop lent et que l’ordinateur a refusé de continuer. Il se pourrait que changer de câble USB-C répare le problème, mais la plupart du temps, il suffit de lancer DBI en mode </w:t>
+      </w:r>
+      <w:proofErr w:type="gramStart"/>
+      <w:r>
+        <w:t>« Non applet</w:t>
+      </w:r>
+      <w:proofErr w:type="gramEnd"/>
+      <w:r>
+        <w:t xml:space="preserve"> mode</w:t>
+      </w:r>
+      <w:proofErr w:type="gramStart"/>
+      <w:r>
+        <w:t> »(</w:t>
+      </w:r>
+      <w:proofErr w:type="gramEnd"/>
+      <w:r>
+        <w:t xml:space="preserve"> voir la section sur le « Applet mode »</w:t>
       </w:r>
       <w:r>
         <w:t>)</w:t>
@@ -3869,7 +4636,23 @@
           <w:b/>
           <w:bCs/>
         </w:rPr>
-        <w:t xml:space="preserve"> Attention : Cette méthode est plus risquée (plus détectable) car vous n’êtes pas protégé par le mode incognito de la switch. Il est recommandé d’utiliser un VPN sur votre ordinateur si vous installez des roms illégales depuis Internet</w:t>
+        <w:t xml:space="preserve"> Attention : Cette méthode est plus risquée (plus détectable) car vous n’êtes pas protégé par le mode incognito </w:t>
+      </w:r>
+      <w:proofErr w:type="gramStart"/>
+      <w:r>
+        <w:rPr>
+          <w:b/>
+          <w:bCs/>
+        </w:rPr>
+        <w:t>de la switch</w:t>
+      </w:r>
+      <w:proofErr w:type="gramEnd"/>
+      <w:r>
+        <w:rPr>
+          <w:b/>
+          <w:bCs/>
+        </w:rPr>
+        <w:t>. Il est recommandé d’utiliser un VPN sur votre ordinateur si vous installez des roms illégales depuis Internet</w:t>
       </w:r>
     </w:p>
     <w:p>
@@ -3902,7 +4685,28 @@
         </w:numPr>
       </w:pPr>
       <w:r>
-        <w:t>Téléchargez une ROM au format .nsp ou .xci depuis Internet.</w:t>
+        <w:t xml:space="preserve">Téléchargez une ROM au </w:t>
+      </w:r>
+      <w:proofErr w:type="gramStart"/>
+      <w:r>
+        <w:t>format .</w:t>
+      </w:r>
+      <w:proofErr w:type="spellStart"/>
+      <w:r>
+        <w:t>nsp</w:t>
+      </w:r>
+      <w:proofErr w:type="spellEnd"/>
+      <w:proofErr w:type="gramEnd"/>
+      <w:r>
+        <w:t xml:space="preserve"> </w:t>
+      </w:r>
+      <w:proofErr w:type="gramStart"/>
+      <w:r>
+        <w:t>ou .xci</w:t>
+      </w:r>
+      <w:proofErr w:type="gramEnd"/>
+      <w:r>
+        <w:t xml:space="preserve"> depuis Internet.</w:t>
       </w:r>
     </w:p>
     <w:p>
@@ -3936,7 +4740,23 @@
         </w:numPr>
       </w:pPr>
       <w:r>
-        <w:t xml:space="preserve">Si vous avez un .zip ou .rar, </w:t>
+        <w:t xml:space="preserve">Si vous avez un .zip </w:t>
+      </w:r>
+      <w:proofErr w:type="gramStart"/>
+      <w:r>
+        <w:t>ou</w:t>
+      </w:r>
+      <w:proofErr w:type="gramEnd"/>
+      <w:r>
+        <w:t xml:space="preserve"> .</w:t>
+      </w:r>
+      <w:proofErr w:type="spellStart"/>
+      <w:r>
+        <w:t>rar</w:t>
+      </w:r>
+      <w:proofErr w:type="spellEnd"/>
+      <w:r>
+        <w:t xml:space="preserve">, </w:t>
       </w:r>
       <w:r>
         <w:rPr>
@@ -3975,7 +4795,15 @@
         </w:numPr>
       </w:pPr>
       <w:r>
-        <w:t xml:space="preserve">.rar → utiliser </w:t>
+        <w:t>.</w:t>
+      </w:r>
+      <w:proofErr w:type="spellStart"/>
+      <w:r>
+        <w:t>rar</w:t>
+      </w:r>
+      <w:proofErr w:type="spellEnd"/>
+      <w:r>
+        <w:t xml:space="preserve"> → utiliser </w:t>
       </w:r>
       <w:r>
         <w:rPr>
@@ -3987,6 +4815,7 @@
       <w:r>
         <w:t xml:space="preserve"> ou </w:t>
       </w:r>
+      <w:proofErr w:type="spellStart"/>
       <w:r>
         <w:rPr>
           <w:b/>
@@ -3994,6 +4823,7 @@
         </w:rPr>
         <w:t>WinRAR</w:t>
       </w:r>
+      <w:proofErr w:type="spellEnd"/>
     </w:p>
     <w:p>
       <w:r>
@@ -4014,7 +4844,23 @@
           <w:b/>
           <w:bCs/>
         </w:rPr>
-        <w:t>Étape 2 : Installer NUT (le serveur USB pour Tinfoil)</w:t>
+        <w:t xml:space="preserve">Étape 2 : Installer NUT (le serveur USB pour </w:t>
+      </w:r>
+      <w:proofErr w:type="spellStart"/>
+      <w:r>
+        <w:rPr>
+          <w:b/>
+          <w:bCs/>
+        </w:rPr>
+        <w:t>Tinfoil</w:t>
+      </w:r>
+      <w:proofErr w:type="spellEnd"/>
+      <w:r>
+        <w:rPr>
+          <w:b/>
+          <w:bCs/>
+        </w:rPr>
+        <w:t>)</w:t>
       </w:r>
     </w:p>
     <w:p>
@@ -4141,7 +4987,20 @@
         <w:t xml:space="preserve"> </w:t>
       </w:r>
       <w:r>
-        <w:t>(usb_install_pc.py pour MacOS ) .</w:t>
+        <w:t xml:space="preserve">(usb_install_pc.py pour </w:t>
+      </w:r>
+      <w:proofErr w:type="spellStart"/>
+      <w:proofErr w:type="gramStart"/>
+      <w:r>
+        <w:t>MacOS</w:t>
+      </w:r>
+      <w:proofErr w:type="spellEnd"/>
+      <w:r>
+        <w:t xml:space="preserve"> )</w:t>
+      </w:r>
+      <w:proofErr w:type="gramEnd"/>
+      <w:r>
+        <w:t xml:space="preserve"> .</w:t>
       </w:r>
     </w:p>
     <w:p>
@@ -4174,11 +5033,39 @@
         </w:numPr>
       </w:pPr>
       <w:r>
-        <w:t>Par défaut, placez vos fichiers .nsp ou .xci dans le dossier :</w:t>
+        <w:t xml:space="preserve">Par défaut, placez vos </w:t>
+      </w:r>
+      <w:proofErr w:type="gramStart"/>
+      <w:r>
+        <w:t>fichiers .</w:t>
+      </w:r>
+      <w:proofErr w:type="spellStart"/>
+      <w:r>
+        <w:t>nsp</w:t>
+      </w:r>
+      <w:proofErr w:type="spellEnd"/>
+      <w:proofErr w:type="gramEnd"/>
+      <w:r>
+        <w:t xml:space="preserve"> </w:t>
+      </w:r>
+      <w:proofErr w:type="gramStart"/>
+      <w:r>
+        <w:t>ou .xci</w:t>
+      </w:r>
+      <w:proofErr w:type="gramEnd"/>
+      <w:r>
+        <w:t xml:space="preserve"> dans le dossier :</w:t>
       </w:r>
       <w:r>
         <w:br/>
-        <w:t>nut/xci/</w:t>
+      </w:r>
+      <w:proofErr w:type="spellStart"/>
+      <w:r>
+        <w:t>nut</w:t>
+      </w:r>
+      <w:proofErr w:type="spellEnd"/>
+      <w:r>
+        <w:t>/xci/</w:t>
       </w:r>
       <w:r>
         <w:br/>
@@ -4192,14 +5079,39 @@
       </w:r>
       <w:r>
         <w:br/>
-        <w:t>nut/nsp/</w:t>
+      </w:r>
+      <w:proofErr w:type="spellStart"/>
+      <w:r>
+        <w:t>nut</w:t>
+      </w:r>
+      <w:proofErr w:type="spellEnd"/>
+      <w:r>
+        <w:t>/</w:t>
+      </w:r>
+      <w:proofErr w:type="spellStart"/>
+      <w:r>
+        <w:t>nsp</w:t>
+      </w:r>
+      <w:proofErr w:type="spellEnd"/>
+      <w:r>
+        <w:t>/</w:t>
       </w:r>
       <w:r>
         <w:br/>
       </w:r>
       <w:r>
         <w:br/>
-        <w:t>ou configurez un chemin dans config.json.</w:t>
+        <w:t xml:space="preserve">ou configurez un chemin dans </w:t>
+      </w:r>
+      <w:proofErr w:type="spellStart"/>
+      <w:proofErr w:type="gramStart"/>
+      <w:r>
+        <w:t>config.json</w:t>
+      </w:r>
+      <w:proofErr w:type="spellEnd"/>
+      <w:proofErr w:type="gramEnd"/>
+      <w:r>
+        <w:t>.</w:t>
       </w:r>
       <w:r>
         <w:br/>
@@ -4271,7 +5183,15 @@
         </w:numPr>
       </w:pPr>
       <w:r>
-        <w:t xml:space="preserve">Lancez Tinfoil → allez dans </w:t>
+        <w:t xml:space="preserve">Lancez </w:t>
+      </w:r>
+      <w:proofErr w:type="spellStart"/>
+      <w:r>
+        <w:t>Tinfoil</w:t>
+      </w:r>
+      <w:proofErr w:type="spellEnd"/>
+      <w:r>
+        <w:t xml:space="preserve"> → allez dans </w:t>
       </w:r>
       <w:r>
         <w:rPr>
@@ -4378,7 +5298,27 @@
           <w:sz w:val="32"/>
           <w:szCs w:val="32"/>
         </w:rPr>
-        <w:t>Installer un jeu via un PC avec Goldleaf et Quark</w:t>
+        <w:t xml:space="preserve">Installer un jeu via un PC avec </w:t>
+      </w:r>
+      <w:proofErr w:type="spellStart"/>
+      <w:r>
+        <w:rPr>
+          <w:b/>
+          <w:bCs/>
+          <w:sz w:val="32"/>
+          <w:szCs w:val="32"/>
+        </w:rPr>
+        <w:t>Goldleaf</w:t>
+      </w:r>
+      <w:proofErr w:type="spellEnd"/>
+      <w:r>
+        <w:rPr>
+          <w:b/>
+          <w:bCs/>
+          <w:sz w:val="32"/>
+          <w:szCs w:val="32"/>
+        </w:rPr>
+        <w:t xml:space="preserve"> et Quark</w:t>
       </w:r>
       <w:bookmarkEnd w:id="9"/>
     </w:p>
@@ -4408,7 +5348,15 @@
       </w:hyperlink>
       <w:r>
         <w:br/>
-        <w:t xml:space="preserve">Zadig tool de la vidéo : </w:t>
+        <w:t xml:space="preserve">Zadig </w:t>
+      </w:r>
+      <w:proofErr w:type="spellStart"/>
+      <w:r>
+        <w:t>tool</w:t>
+      </w:r>
+      <w:proofErr w:type="spellEnd"/>
+      <w:r>
+        <w:t xml:space="preserve"> de la vidéo : </w:t>
       </w:r>
       <w:r>
         <w:br/>
@@ -4488,15 +5436,40 @@
           <w:b/>
           <w:bCs/>
         </w:rPr>
-        <w:t>Étape 1 : Lancer la console en mode Hekate</w:t>
-      </w:r>
+        <w:t xml:space="preserve">Étape 1 : Lancer la console en mode </w:t>
+      </w:r>
+      <w:proofErr w:type="spellStart"/>
+      <w:r>
+        <w:rPr>
+          <w:b/>
+          <w:bCs/>
+        </w:rPr>
+        <w:t>Hekate</w:t>
+      </w:r>
+      <w:proofErr w:type="spellEnd"/>
     </w:p>
     <w:p>
       <w:r>
         <w:t xml:space="preserve">Démarrez l’option </w:t>
       </w:r>
       <w:r>
-        <w:t xml:space="preserve">« More configs ». Vous y trouverez l’option lineage. Sélectionnez ce mode de boot et patientez quelques minutes. </w:t>
+        <w:t xml:space="preserve">« More </w:t>
+      </w:r>
+      <w:proofErr w:type="spellStart"/>
+      <w:r>
+        <w:t>configs</w:t>
+      </w:r>
+      <w:proofErr w:type="spellEnd"/>
+      <w:r>
+        <w:t xml:space="preserve"> ». Vous y trouverez l’option </w:t>
+      </w:r>
+      <w:proofErr w:type="spellStart"/>
+      <w:r>
+        <w:t>lineage</w:t>
+      </w:r>
+      <w:proofErr w:type="spellEnd"/>
+      <w:r>
+        <w:t xml:space="preserve">. Sélectionnez ce mode de boot et patientez quelques minutes. </w:t>
       </w:r>
     </w:p>
     <w:p>
@@ -4514,7 +5487,15 @@
         <w:t xml:space="preserve">IMPORTANT : </w:t>
       </w:r>
       <w:r>
-        <w:t xml:space="preserve">Si votre console peut démarrer android, si vous voulez étendre votre stockage avec une nouvelle carte SD, transférer les fichiers uniquement ne suffira pas. Il faudra passer par un logiciel tiers pour cloner la carte SD, puis la réécrire sur une autre et étendre les partitions en fonction des besoins. </w:t>
+        <w:t xml:space="preserve">Si votre console peut démarrer </w:t>
+      </w:r>
+      <w:proofErr w:type="spellStart"/>
+      <w:r>
+        <w:t>android</w:t>
+      </w:r>
+      <w:proofErr w:type="spellEnd"/>
+      <w:r>
+        <w:t xml:space="preserve">, si vous voulez étendre votre stockage avec une nouvelle carte SD, transférer les fichiers uniquement ne suffira pas. Il faudra passer par un logiciel tiers pour cloner la carte SD, puis la réécrire sur une autre et étendre les partitions en fonction des besoins. </w:t>
       </w:r>
     </w:p>
     <w:p>
@@ -4678,7 +5659,31 @@
           <w:lang w:val="en-US" w:eastAsia="fr-FR"/>
           <w14:ligatures w14:val="none"/>
         </w:rPr>
-        <w:t xml:space="preserve"> installé (via Homebrew App Store)</w:t>
+        <w:t xml:space="preserve"> </w:t>
+      </w:r>
+      <w:proofErr w:type="spellStart"/>
+      <w:r>
+        <w:rPr>
+          <w:rFonts w:eastAsia="Times New Roman" w:cs="Times New Roman"/>
+          <w:kern w:val="0"/>
+          <w:sz w:val="24"/>
+          <w:szCs w:val="24"/>
+          <w:lang w:val="en-US" w:eastAsia="fr-FR"/>
+          <w14:ligatures w14:val="none"/>
+        </w:rPr>
+        <w:t>installé</w:t>
+      </w:r>
+      <w:proofErr w:type="spellEnd"/>
+      <w:r>
+        <w:rPr>
+          <w:rFonts w:eastAsia="Times New Roman" w:cs="Times New Roman"/>
+          <w:kern w:val="0"/>
+          <w:sz w:val="24"/>
+          <w:szCs w:val="24"/>
+          <w:lang w:val="en-US" w:eastAsia="fr-FR"/>
+          <w14:ligatures w14:val="none"/>
+        </w:rPr>
+        <w:t xml:space="preserve"> (via Homebrew App Store)</w:t>
       </w:r>
     </w:p>
     <w:p>
@@ -4780,7 +5785,31 @@
           <w:lang w:eastAsia="fr-FR"/>
           <w14:ligatures w14:val="none"/>
         </w:rPr>
-        <w:t xml:space="preserve"> (intégré à Tinfoil ou autre)</w:t>
+        <w:t xml:space="preserve"> (intégré à </w:t>
+      </w:r>
+      <w:proofErr w:type="spellStart"/>
+      <w:r>
+        <w:rPr>
+          <w:rFonts w:eastAsia="Times New Roman" w:cs="Times New Roman"/>
+          <w:kern w:val="0"/>
+          <w:sz w:val="24"/>
+          <w:szCs w:val="24"/>
+          <w:lang w:eastAsia="fr-FR"/>
+          <w14:ligatures w14:val="none"/>
+        </w:rPr>
+        <w:t>Tinfoil</w:t>
+      </w:r>
+      <w:proofErr w:type="spellEnd"/>
+      <w:r>
+        <w:rPr>
+          <w:rFonts w:eastAsia="Times New Roman" w:cs="Times New Roman"/>
+          <w:kern w:val="0"/>
+          <w:sz w:val="24"/>
+          <w:szCs w:val="24"/>
+          <w:lang w:eastAsia="fr-FR"/>
+          <w14:ligatures w14:val="none"/>
+        </w:rPr>
+        <w:t xml:space="preserve"> ou autre)</w:t>
       </w:r>
     </w:p>
     <w:p>
@@ -4914,6 +5943,7 @@
         </w:rPr>
         <w:t xml:space="preserve">Démarre ta console en </w:t>
       </w:r>
+      <w:proofErr w:type="spellStart"/>
       <w:r>
         <w:rPr>
           <w:rFonts w:eastAsia="Times New Roman" w:cs="Times New Roman"/>
@@ -4927,6 +5957,7 @@
         </w:rPr>
         <w:t>EmuMMC</w:t>
       </w:r>
+      <w:proofErr w:type="spellEnd"/>
     </w:p>
     <w:p>
       <w:pPr>
@@ -5443,7 +6474,31 @@
           <w:lang w:eastAsia="fr-FR"/>
           <w14:ligatures w14:val="none"/>
         </w:rPr>
-        <w:t>Tu peux donner un nom à la sauvegarde (ex. avant_boss_final)</w:t>
+        <w:t xml:space="preserve">Tu peux donner un nom à la sauvegarde (ex. </w:t>
+      </w:r>
+      <w:proofErr w:type="spellStart"/>
+      <w:r>
+        <w:rPr>
+          <w:rFonts w:eastAsia="Times New Roman" w:cs="Times New Roman"/>
+          <w:kern w:val="0"/>
+          <w:sz w:val="24"/>
+          <w:szCs w:val="24"/>
+          <w:lang w:eastAsia="fr-FR"/>
+          <w14:ligatures w14:val="none"/>
+        </w:rPr>
+        <w:t>avant_boss_final</w:t>
+      </w:r>
+      <w:proofErr w:type="spellEnd"/>
+      <w:r>
+        <w:rPr>
+          <w:rFonts w:eastAsia="Times New Roman" w:cs="Times New Roman"/>
+          <w:kern w:val="0"/>
+          <w:sz w:val="24"/>
+          <w:szCs w:val="24"/>
+          <w:lang w:eastAsia="fr-FR"/>
+          <w14:ligatures w14:val="none"/>
+        </w:rPr>
+        <w:t>)</w:t>
       </w:r>
       <w:r>
         <w:rPr>
@@ -5622,7 +6677,35 @@
           <w:lang w:eastAsia="fr-FR"/>
           <w14:ligatures w14:val="none"/>
         </w:rPr>
-        <w:t xml:space="preserve"> Option 1 : Transfert via USB File Transfer (depuis Tinfoil)</w:t>
+        <w:t xml:space="preserve"> Option 1 : Transfert via USB File Transfer (depuis </w:t>
+      </w:r>
+      <w:proofErr w:type="spellStart"/>
+      <w:r>
+        <w:rPr>
+          <w:rFonts w:eastAsia="Times New Roman" w:cs="Times New Roman"/>
+          <w:b/>
+          <w:bCs/>
+          <w:kern w:val="0"/>
+          <w:sz w:val="24"/>
+          <w:szCs w:val="24"/>
+          <w:lang w:eastAsia="fr-FR"/>
+          <w14:ligatures w14:val="none"/>
+        </w:rPr>
+        <w:t>Tinfoil</w:t>
+      </w:r>
+      <w:proofErr w:type="spellEnd"/>
+      <w:r>
+        <w:rPr>
+          <w:rFonts w:eastAsia="Times New Roman" w:cs="Times New Roman"/>
+          <w:b/>
+          <w:bCs/>
+          <w:kern w:val="0"/>
+          <w:sz w:val="24"/>
+          <w:szCs w:val="24"/>
+          <w:lang w:eastAsia="fr-FR"/>
+          <w14:ligatures w14:val="none"/>
+        </w:rPr>
+        <w:t>)</w:t>
       </w:r>
     </w:p>
     <w:p>
@@ -5715,6 +6798,7 @@
         </w:rPr>
         <w:t xml:space="preserve">Lance </w:t>
       </w:r>
+      <w:proofErr w:type="spellStart"/>
       <w:r>
         <w:rPr>
           <w:rFonts w:eastAsia="Times New Roman" w:cs="Times New Roman"/>
@@ -5728,6 +6812,7 @@
         </w:rPr>
         <w:t>Tinfoil</w:t>
       </w:r>
+      <w:proofErr w:type="spellEnd"/>
       <w:r>
         <w:rPr>
           <w:rFonts w:eastAsia="Times New Roman" w:cs="Times New Roman"/>
@@ -5839,7 +6924,31 @@
           <w:lang w:eastAsia="fr-FR"/>
           <w14:ligatures w14:val="none"/>
         </w:rPr>
-        <w:t xml:space="preserve">sur ton ordinateur  dans </w:t>
+        <w:t xml:space="preserve">sur ton </w:t>
+      </w:r>
+      <w:proofErr w:type="gramStart"/>
+      <w:r>
+        <w:rPr>
+          <w:rFonts w:eastAsia="Times New Roman" w:cs="Times New Roman"/>
+          <w:kern w:val="0"/>
+          <w:sz w:val="24"/>
+          <w:szCs w:val="24"/>
+          <w:lang w:eastAsia="fr-FR"/>
+          <w14:ligatures w14:val="none"/>
+        </w:rPr>
+        <w:t>ordinateur  dans</w:t>
+      </w:r>
+      <w:proofErr w:type="gramEnd"/>
+      <w:r>
+        <w:rPr>
+          <w:rFonts w:eastAsia="Times New Roman" w:cs="Times New Roman"/>
+          <w:kern w:val="0"/>
+          <w:sz w:val="24"/>
+          <w:szCs w:val="24"/>
+          <w:lang w:eastAsia="fr-FR"/>
+          <w14:ligatures w14:val="none"/>
+        </w:rPr>
+        <w:t xml:space="preserve"> </w:t>
       </w:r>
       <w:r>
         <w:rPr>
@@ -6032,7 +7141,31 @@
           <w:lang w:eastAsia="fr-FR"/>
           <w14:ligatures w14:val="none"/>
         </w:rPr>
-        <w:t>Retire la carte microSD et insère-la dans ton PC</w:t>
+        <w:t xml:space="preserve">Retire la carte </w:t>
+      </w:r>
+      <w:proofErr w:type="spellStart"/>
+      <w:r>
+        <w:rPr>
+          <w:rFonts w:eastAsia="Times New Roman" w:cs="Times New Roman"/>
+          <w:kern w:val="0"/>
+          <w:sz w:val="24"/>
+          <w:szCs w:val="24"/>
+          <w:lang w:eastAsia="fr-FR"/>
+          <w14:ligatures w14:val="none"/>
+        </w:rPr>
+        <w:t>microSD</w:t>
+      </w:r>
+      <w:proofErr w:type="spellEnd"/>
+      <w:r>
+        <w:rPr>
+          <w:rFonts w:eastAsia="Times New Roman" w:cs="Times New Roman"/>
+          <w:kern w:val="0"/>
+          <w:sz w:val="24"/>
+          <w:szCs w:val="24"/>
+          <w:lang w:eastAsia="fr-FR"/>
+          <w14:ligatures w14:val="none"/>
+        </w:rPr>
+        <w:t xml:space="preserve"> et insère-la dans ton PC</w:t>
       </w:r>
     </w:p>
     <w:p>
@@ -6433,7 +7566,55 @@
           <w:lang w:eastAsia="fr-FR"/>
           <w14:ligatures w14:val="none"/>
         </w:rPr>
-        <w:t xml:space="preserve"> Renomme tes sauvegardes avec une date ou un événement (ex: avant_nouvelle_zone)</w:t>
+        <w:t xml:space="preserve"> Renomme tes sauvegardes avec une date ou un événement (</w:t>
+      </w:r>
+      <w:proofErr w:type="gramStart"/>
+      <w:r>
+        <w:rPr>
+          <w:rFonts w:eastAsia="Times New Roman" w:cs="Times New Roman"/>
+          <w:kern w:val="0"/>
+          <w:sz w:val="24"/>
+          <w:szCs w:val="24"/>
+          <w:lang w:eastAsia="fr-FR"/>
+          <w14:ligatures w14:val="none"/>
+        </w:rPr>
+        <w:t>ex:</w:t>
+      </w:r>
+      <w:proofErr w:type="gramEnd"/>
+      <w:r>
+        <w:rPr>
+          <w:rFonts w:eastAsia="Times New Roman" w:cs="Times New Roman"/>
+          <w:kern w:val="0"/>
+          <w:sz w:val="24"/>
+          <w:szCs w:val="24"/>
+          <w:lang w:eastAsia="fr-FR"/>
+          <w14:ligatures w14:val="none"/>
+        </w:rPr>
+        <w:t xml:space="preserve"> </w:t>
+      </w:r>
+      <w:proofErr w:type="spellStart"/>
+      <w:r>
+        <w:rPr>
+          <w:rFonts w:eastAsia="Times New Roman" w:cs="Times New Roman"/>
+          <w:kern w:val="0"/>
+          <w:sz w:val="24"/>
+          <w:szCs w:val="24"/>
+          <w:lang w:eastAsia="fr-FR"/>
+          <w14:ligatures w14:val="none"/>
+        </w:rPr>
+        <w:t>avant_nouvelle_zone</w:t>
+      </w:r>
+      <w:proofErr w:type="spellEnd"/>
+      <w:r>
+        <w:rPr>
+          <w:rFonts w:eastAsia="Times New Roman" w:cs="Times New Roman"/>
+          <w:kern w:val="0"/>
+          <w:sz w:val="24"/>
+          <w:szCs w:val="24"/>
+          <w:lang w:eastAsia="fr-FR"/>
+          <w14:ligatures w14:val="none"/>
+        </w:rPr>
+        <w:t>)</w:t>
       </w:r>
     </w:p>
     <w:p>
@@ -6909,7 +8090,39 @@
     <w:p>
       <w:r>
         <w:br/>
-        <w:t>Pour se faire, il faut pouvoir accéder à Ultrahand. Ultrahand est une interface qui se met sur l’écran lorsque l’on fait la combinaison suivante de touches : L + Dpad bas + presser sur le joystick droit. Le menu Ultrahand apparait. Il suffit ensuite de faire les étapes suivantes :</w:t>
+        <w:t xml:space="preserve">Pour se faire, il faut pouvoir accéder à </w:t>
+      </w:r>
+      <w:proofErr w:type="spellStart"/>
+      <w:r>
+        <w:t>Ultrahand</w:t>
+      </w:r>
+      <w:proofErr w:type="spellEnd"/>
+      <w:r>
+        <w:t xml:space="preserve">. </w:t>
+      </w:r>
+      <w:proofErr w:type="spellStart"/>
+      <w:r>
+        <w:t>Ultrahand</w:t>
+      </w:r>
+      <w:proofErr w:type="spellEnd"/>
+      <w:r>
+        <w:t xml:space="preserve"> est une interface qui se met sur l’écran lorsque l’on fait la combinaison suivante de touches : L + </w:t>
+      </w:r>
+      <w:proofErr w:type="spellStart"/>
+      <w:r>
+        <w:t>Dpad</w:t>
+      </w:r>
+      <w:proofErr w:type="spellEnd"/>
+      <w:r>
+        <w:t xml:space="preserve"> bas + presser sur le joystick droit. Le menu </w:t>
+      </w:r>
+      <w:proofErr w:type="spellStart"/>
+      <w:r>
+        <w:t>Ultrahand</w:t>
+      </w:r>
+      <w:proofErr w:type="spellEnd"/>
+      <w:r>
+        <w:t xml:space="preserve"> apparait. Il suffit ensuite de faire les étapes suivantes :</w:t>
       </w:r>
     </w:p>
     <w:p>
@@ -7302,7 +8515,15 @@
         </w:rPr>
       </w:pPr>
       <w:r>
-        <w:t xml:space="preserve">Ici on peut y sélectionner la fréquence par défaut en fonction du mode de jeu et de certains paramètres. N’hésitez pas à aller regarder des vidéos youtube pour avoir des valeurs optimales. </w:t>
+        <w:t xml:space="preserve">Ici on peut y sélectionner la fréquence par défaut en fonction du mode de jeu et de certains paramètres. N’hésitez pas à aller regarder des vidéos </w:t>
+      </w:r>
+      <w:proofErr w:type="spellStart"/>
+      <w:r>
+        <w:t>youtube</w:t>
+      </w:r>
+      <w:proofErr w:type="spellEnd"/>
+      <w:r>
+        <w:t xml:space="preserve"> pour avoir des valeurs optimales. </w:t>
       </w:r>
       <w:r>
         <w:br/>
@@ -7394,7 +8615,31 @@
           <w14:ligatures w14:val="none"/>
         </w:rPr>
         <w:br/>
-        <w:t xml:space="preserve">R : En mode EmuMMC, si vous ne désactivez pas volontairement le DNS 90DNS et retirez le mode incognito, vous ne pouvez pas vous faire bannir. </w:t>
+        <w:t xml:space="preserve">R : En mode </w:t>
+      </w:r>
+      <w:proofErr w:type="spellStart"/>
+      <w:r>
+        <w:rPr>
+          <w:rFonts w:eastAsia="Times New Roman" w:cs="Times New Roman"/>
+          <w:kern w:val="0"/>
+          <w:sz w:val="24"/>
+          <w:szCs w:val="24"/>
+          <w:lang w:eastAsia="fr-FR"/>
+          <w14:ligatures w14:val="none"/>
+        </w:rPr>
+        <w:t>EmuMMC</w:t>
+      </w:r>
+      <w:proofErr w:type="spellEnd"/>
+      <w:r>
+        <w:rPr>
+          <w:rFonts w:eastAsia="Times New Roman" w:cs="Times New Roman"/>
+          <w:kern w:val="0"/>
+          <w:sz w:val="24"/>
+          <w:szCs w:val="24"/>
+          <w:lang w:eastAsia="fr-FR"/>
+          <w14:ligatures w14:val="none"/>
+        </w:rPr>
+        <w:t xml:space="preserve">, si vous ne désactivez pas volontairement le DNS 90DNS et retirez le mode incognito, vous ne pouvez pas vous faire bannir. </w:t>
       </w:r>
     </w:p>
     <w:p>
@@ -7420,8 +8665,38 @@
           <w:lang w:eastAsia="fr-FR"/>
           <w14:ligatures w14:val="none"/>
         </w:rPr>
-        <w:t>Q : Est-ce que je peux jouer en ligne avec les jeux installés via Tinfoil?</w:t>
-      </w:r>
+        <w:t xml:space="preserve">Q : Est-ce que je peux jouer en ligne avec les jeux installés via </w:t>
+      </w:r>
+      <w:proofErr w:type="spellStart"/>
+      <w:proofErr w:type="gramStart"/>
+      <w:r>
+        <w:rPr>
+          <w:rFonts w:eastAsia="Times New Roman" w:cs="Times New Roman"/>
+          <w:b/>
+          <w:bCs/>
+          <w:kern w:val="0"/>
+          <w:sz w:val="24"/>
+          <w:szCs w:val="24"/>
+          <w:lang w:eastAsia="fr-FR"/>
+          <w14:ligatures w14:val="none"/>
+        </w:rPr>
+        <w:t>Tinfoil</w:t>
+      </w:r>
+      <w:proofErr w:type="spellEnd"/>
+      <w:r>
+        <w:rPr>
+          <w:rFonts w:eastAsia="Times New Roman" w:cs="Times New Roman"/>
+          <w:b/>
+          <w:bCs/>
+          <w:kern w:val="0"/>
+          <w:sz w:val="24"/>
+          <w:szCs w:val="24"/>
+          <w:lang w:eastAsia="fr-FR"/>
+          <w14:ligatures w14:val="none"/>
+        </w:rPr>
+        <w:t>?</w:t>
+      </w:r>
+      <w:proofErr w:type="gramEnd"/>
       <w:r>
         <w:rPr>
           <w:rFonts w:eastAsia="Times New Roman" w:cs="Times New Roman"/>
@@ -7432,7 +8707,151 @@
           <w14:ligatures w14:val="none"/>
         </w:rPr>
         <w:br/>
-        <w:t>R : Non, la console échouera à se connecter aux serveurs et vous aurez une erreur de connexion. En revanche les jeux que vous possédez réellement peuvent être utilisés en ligne si vous lancez votre console avec l’option « sysMMC » . Certains jeux qui ne passent pas par les services Nintendo peuvent par contre parfois fonctionner ( ex : Fortnite, Rocket league, etc… qui fonctionnent indépendamment des serveurs de Nintendo parfois)</w:t>
+        <w:t>R : Non, la console échouera à se connecter aux serveurs et vous aurez une erreur de connexion. En revanche les jeux que vous possédez réellement peuvent être utilisés en ligne si vous lancez votre console avec l’option « </w:t>
+      </w:r>
+      <w:proofErr w:type="spellStart"/>
+      <w:r>
+        <w:rPr>
+          <w:rFonts w:eastAsia="Times New Roman" w:cs="Times New Roman"/>
+          <w:kern w:val="0"/>
+          <w:sz w:val="24"/>
+          <w:szCs w:val="24"/>
+          <w:lang w:eastAsia="fr-FR"/>
+          <w14:ligatures w14:val="none"/>
+        </w:rPr>
+        <w:t>sysMMC</w:t>
+      </w:r>
+      <w:proofErr w:type="spellEnd"/>
+      <w:r>
+        <w:rPr>
+          <w:rFonts w:eastAsia="Times New Roman" w:cs="Times New Roman"/>
+          <w:kern w:val="0"/>
+          <w:sz w:val="24"/>
+          <w:szCs w:val="24"/>
+          <w:lang w:eastAsia="fr-FR"/>
+          <w14:ligatures w14:val="none"/>
+        </w:rPr>
+        <w:t> </w:t>
+      </w:r>
+      <w:proofErr w:type="gramStart"/>
+      <w:r>
+        <w:rPr>
+          <w:rFonts w:eastAsia="Times New Roman" w:cs="Times New Roman"/>
+          <w:kern w:val="0"/>
+          <w:sz w:val="24"/>
+          <w:szCs w:val="24"/>
+          <w:lang w:eastAsia="fr-FR"/>
+          <w14:ligatures w14:val="none"/>
+        </w:rPr>
+        <w:t>» .</w:t>
+      </w:r>
+      <w:proofErr w:type="gramEnd"/>
+      <w:r>
+        <w:rPr>
+          <w:rFonts w:eastAsia="Times New Roman" w:cs="Times New Roman"/>
+          <w:kern w:val="0"/>
+          <w:sz w:val="24"/>
+          <w:szCs w:val="24"/>
+          <w:lang w:eastAsia="fr-FR"/>
+          <w14:ligatures w14:val="none"/>
+        </w:rPr>
+        <w:t xml:space="preserve"> Certains jeux qui ne passent pas par les services Nintendo peuvent </w:t>
+      </w:r>
+      <w:proofErr w:type="gramStart"/>
+      <w:r>
+        <w:rPr>
+          <w:rFonts w:eastAsia="Times New Roman" w:cs="Times New Roman"/>
+          <w:kern w:val="0"/>
+          <w:sz w:val="24"/>
+          <w:szCs w:val="24"/>
+          <w:lang w:eastAsia="fr-FR"/>
+          <w14:ligatures w14:val="none"/>
+        </w:rPr>
+        <w:t>par contre</w:t>
+      </w:r>
+      <w:proofErr w:type="gramEnd"/>
+      <w:r>
+        <w:rPr>
+          <w:rFonts w:eastAsia="Times New Roman" w:cs="Times New Roman"/>
+          <w:kern w:val="0"/>
+          <w:sz w:val="24"/>
+          <w:szCs w:val="24"/>
+          <w:lang w:eastAsia="fr-FR"/>
+          <w14:ligatures w14:val="none"/>
+        </w:rPr>
+        <w:t xml:space="preserve"> parfois fonctionner </w:t>
+      </w:r>
+      <w:proofErr w:type="gramStart"/>
+      <w:r>
+        <w:rPr>
+          <w:rFonts w:eastAsia="Times New Roman" w:cs="Times New Roman"/>
+          <w:kern w:val="0"/>
+          <w:sz w:val="24"/>
+          <w:szCs w:val="24"/>
+          <w:lang w:eastAsia="fr-FR"/>
+          <w14:ligatures w14:val="none"/>
+        </w:rPr>
+        <w:t>( ex</w:t>
+      </w:r>
+      <w:proofErr w:type="gramEnd"/>
+      <w:r>
+        <w:rPr>
+          <w:rFonts w:eastAsia="Times New Roman" w:cs="Times New Roman"/>
+          <w:kern w:val="0"/>
+          <w:sz w:val="24"/>
+          <w:szCs w:val="24"/>
+          <w:lang w:eastAsia="fr-FR"/>
+          <w14:ligatures w14:val="none"/>
+        </w:rPr>
+        <w:t xml:space="preserve"> : </w:t>
+      </w:r>
+      <w:proofErr w:type="spellStart"/>
+      <w:r>
+        <w:rPr>
+          <w:rFonts w:eastAsia="Times New Roman" w:cs="Times New Roman"/>
+          <w:kern w:val="0"/>
+          <w:sz w:val="24"/>
+          <w:szCs w:val="24"/>
+          <w:lang w:eastAsia="fr-FR"/>
+          <w14:ligatures w14:val="none"/>
+        </w:rPr>
+        <w:t>Fortnite</w:t>
+      </w:r>
+      <w:proofErr w:type="spellEnd"/>
+      <w:r>
+        <w:rPr>
+          <w:rFonts w:eastAsia="Times New Roman" w:cs="Times New Roman"/>
+          <w:kern w:val="0"/>
+          <w:sz w:val="24"/>
+          <w:szCs w:val="24"/>
+          <w:lang w:eastAsia="fr-FR"/>
+          <w14:ligatures w14:val="none"/>
+        </w:rPr>
+        <w:t xml:space="preserve">, Rocket </w:t>
+      </w:r>
+      <w:proofErr w:type="spellStart"/>
+      <w:r>
+        <w:rPr>
+          <w:rFonts w:eastAsia="Times New Roman" w:cs="Times New Roman"/>
+          <w:kern w:val="0"/>
+          <w:sz w:val="24"/>
+          <w:szCs w:val="24"/>
+          <w:lang w:eastAsia="fr-FR"/>
+          <w14:ligatures w14:val="none"/>
+        </w:rPr>
+        <w:t>league</w:t>
+      </w:r>
+      <w:proofErr w:type="spellEnd"/>
+      <w:r>
+        <w:rPr>
+          <w:rFonts w:eastAsia="Times New Roman" w:cs="Times New Roman"/>
+          <w:kern w:val="0"/>
+          <w:sz w:val="24"/>
+          <w:szCs w:val="24"/>
+          <w:lang w:eastAsia="fr-FR"/>
+          <w14:ligatures w14:val="none"/>
+        </w:rPr>
+        <w:t>, etc… qui fonctionnent indépendamment des serveurs de Nintendo parfois)</w:t>
       </w:r>
     </w:p>
     <w:p>
@@ -7472,7 +8891,31 @@
           <w14:ligatures w14:val="none"/>
         </w:rPr>
         <w:br/>
-        <w:t>R : Oui, en redémarrant sans mod, vous êtes sur la console d’origine (SysNAND), à condition de ne pas l’avoir modifiée.</w:t>
+        <w:t>R : Oui, en redémarrant sans mod, vous êtes sur la console d’origine (</w:t>
+      </w:r>
+      <w:proofErr w:type="spellStart"/>
+      <w:r>
+        <w:rPr>
+          <w:rFonts w:eastAsia="Times New Roman" w:cs="Times New Roman"/>
+          <w:kern w:val="0"/>
+          <w:sz w:val="24"/>
+          <w:szCs w:val="24"/>
+          <w:lang w:eastAsia="fr-FR"/>
+          <w14:ligatures w14:val="none"/>
+        </w:rPr>
+        <w:t>SysNAND</w:t>
+      </w:r>
+      <w:proofErr w:type="spellEnd"/>
+      <w:r>
+        <w:rPr>
+          <w:rFonts w:eastAsia="Times New Roman" w:cs="Times New Roman"/>
+          <w:kern w:val="0"/>
+          <w:sz w:val="24"/>
+          <w:szCs w:val="24"/>
+          <w:lang w:eastAsia="fr-FR"/>
+          <w14:ligatures w14:val="none"/>
+        </w:rPr>
+        <w:t>), à condition de ne pas l’avoir modifiée.</w:t>
       </w:r>
       <w:r>
         <w:rPr>
@@ -7509,8 +8952,51 @@
           <w:lang w:eastAsia="fr-FR"/>
           <w14:ligatures w14:val="none"/>
         </w:rPr>
-        <w:t>Q : Qu’est-ce que le «Applet Mode »  ?</w:t>
-      </w:r>
+        <w:t>Q : Qu’est-ce que le</w:t>
+      </w:r>
+      <w:proofErr w:type="gramStart"/>
+      <w:r>
+        <w:rPr>
+          <w:rFonts w:eastAsia="Times New Roman" w:cs="Times New Roman"/>
+          <w:b/>
+          <w:bCs/>
+          <w:kern w:val="0"/>
+          <w:sz w:val="24"/>
+          <w:szCs w:val="24"/>
+          <w:lang w:eastAsia="fr-FR"/>
+          <w14:ligatures w14:val="none"/>
+        </w:rPr>
+        <w:t xml:space="preserve"> «Applet</w:t>
+      </w:r>
+      <w:proofErr w:type="gramEnd"/>
+      <w:r>
+        <w:rPr>
+          <w:rFonts w:eastAsia="Times New Roman" w:cs="Times New Roman"/>
+          <w:b/>
+          <w:bCs/>
+          <w:kern w:val="0"/>
+          <w:sz w:val="24"/>
+          <w:szCs w:val="24"/>
+          <w:lang w:eastAsia="fr-FR"/>
+          <w14:ligatures w14:val="none"/>
+        </w:rPr>
+        <w:t xml:space="preserve"> Mode </w:t>
+      </w:r>
+      <w:proofErr w:type="gramStart"/>
+      <w:r>
+        <w:rPr>
+          <w:rFonts w:eastAsia="Times New Roman" w:cs="Times New Roman"/>
+          <w:b/>
+          <w:bCs/>
+          <w:kern w:val="0"/>
+          <w:sz w:val="24"/>
+          <w:szCs w:val="24"/>
+          <w:lang w:eastAsia="fr-FR"/>
+          <w14:ligatures w14:val="none"/>
+        </w:rPr>
+        <w:t>»  ?</w:t>
+      </w:r>
+      <w:proofErr w:type="gramEnd"/>
       <w:r>
         <w:rPr>
           <w:rFonts w:eastAsia="Times New Roman" w:cs="Times New Roman"/>
@@ -7521,7 +9007,55 @@
           <w14:ligatures w14:val="none"/>
         </w:rPr>
         <w:br/>
-        <w:t>R : C’est un mode qui est démarré non pas comme programme principal de la console, mais qui tourne en parallèle d’un jeu. Pour quitter le « applet mode » il suffit de lancer un jeu en gardant le bouton « R» appuyé. Cela ouvrira le menu de sélection des applications. De là vous lancerez toutes les applications en mode normal, et pas en mode  « applet »  </w:t>
+        <w:t>R : C’est un mode qui est démarré non pas comme programme principal de la console, mais qui tourne en parallèle d’un jeu. Pour quitter le « applet mode » il suffit de lancer un jeu en gardant le bouton « </w:t>
+      </w:r>
+      <w:proofErr w:type="gramStart"/>
+      <w:r>
+        <w:rPr>
+          <w:rFonts w:eastAsia="Times New Roman" w:cs="Times New Roman"/>
+          <w:kern w:val="0"/>
+          <w:sz w:val="24"/>
+          <w:szCs w:val="24"/>
+          <w:lang w:eastAsia="fr-FR"/>
+          <w14:ligatures w14:val="none"/>
+        </w:rPr>
+        <w:t>R»</w:t>
+      </w:r>
+      <w:proofErr w:type="gramEnd"/>
+      <w:r>
+        <w:rPr>
+          <w:rFonts w:eastAsia="Times New Roman" w:cs="Times New Roman"/>
+          <w:kern w:val="0"/>
+          <w:sz w:val="24"/>
+          <w:szCs w:val="24"/>
+          <w:lang w:eastAsia="fr-FR"/>
+          <w14:ligatures w14:val="none"/>
+        </w:rPr>
+        <w:t xml:space="preserve"> appuyé. Cela ouvrira le menu de sélection des applications. De là vous lancerez toutes les applications en mode normal, et pas en </w:t>
+      </w:r>
+      <w:proofErr w:type="gramStart"/>
+      <w:r>
+        <w:rPr>
+          <w:rFonts w:eastAsia="Times New Roman" w:cs="Times New Roman"/>
+          <w:kern w:val="0"/>
+          <w:sz w:val="24"/>
+          <w:szCs w:val="24"/>
+          <w:lang w:eastAsia="fr-FR"/>
+          <w14:ligatures w14:val="none"/>
+        </w:rPr>
+        <w:t>mode  «</w:t>
+      </w:r>
+      <w:proofErr w:type="gramEnd"/>
+      <w:r>
+        <w:rPr>
+          <w:rFonts w:eastAsia="Times New Roman" w:cs="Times New Roman"/>
+          <w:kern w:val="0"/>
+          <w:sz w:val="24"/>
+          <w:szCs w:val="24"/>
+          <w:lang w:eastAsia="fr-FR"/>
+          <w14:ligatures w14:val="none"/>
+        </w:rPr>
+        <w:t xml:space="preserve"> applet »  </w:t>
       </w:r>
     </w:p>
     <w:p>
@@ -7574,7 +9108,68 @@
           <w:lang w:eastAsia="fr-FR"/>
           <w14:ligatures w14:val="none"/>
         </w:rPr>
-        <w:t xml:space="preserve">R : Mettez votre carte SD neuve dans votre ordinateur et formatez la en format Fat32 (pas NTFS ni exFAT  ). Ensuite, copiez tous les fichiers de votre carte SD déjà existante sur votre nouvelle carte SD et le tour est joué. </w:t>
+        <w:t xml:space="preserve">R : Mettez votre carte SD neuve dans votre ordinateur et </w:t>
+      </w:r>
+      <w:proofErr w:type="gramStart"/>
+      <w:r>
+        <w:rPr>
+          <w:rFonts w:eastAsia="Times New Roman" w:cs="Times New Roman"/>
+          <w:kern w:val="0"/>
+          <w:sz w:val="24"/>
+          <w:szCs w:val="24"/>
+          <w:lang w:eastAsia="fr-FR"/>
+          <w14:ligatures w14:val="none"/>
+        </w:rPr>
+        <w:t>formatez la</w:t>
+      </w:r>
+      <w:proofErr w:type="gramEnd"/>
+      <w:r>
+        <w:rPr>
+          <w:rFonts w:eastAsia="Times New Roman" w:cs="Times New Roman"/>
+          <w:kern w:val="0"/>
+          <w:sz w:val="24"/>
+          <w:szCs w:val="24"/>
+          <w:lang w:eastAsia="fr-FR"/>
+          <w14:ligatures w14:val="none"/>
+        </w:rPr>
+        <w:t xml:space="preserve"> en format Fat32 (pas NTFS ni </w:t>
+      </w:r>
+      <w:proofErr w:type="spellStart"/>
+      <w:proofErr w:type="gramStart"/>
+      <w:r>
+        <w:rPr>
+          <w:rFonts w:eastAsia="Times New Roman" w:cs="Times New Roman"/>
+          <w:kern w:val="0"/>
+          <w:sz w:val="24"/>
+          <w:szCs w:val="24"/>
+          <w:lang w:eastAsia="fr-FR"/>
+          <w14:ligatures w14:val="none"/>
+        </w:rPr>
+        <w:t>exFAT</w:t>
+      </w:r>
+      <w:proofErr w:type="spellEnd"/>
+      <w:r>
+        <w:rPr>
+          <w:rFonts w:eastAsia="Times New Roman" w:cs="Times New Roman"/>
+          <w:kern w:val="0"/>
+          <w:sz w:val="24"/>
+          <w:szCs w:val="24"/>
+          <w:lang w:eastAsia="fr-FR"/>
+          <w14:ligatures w14:val="none"/>
+        </w:rPr>
+        <w:t xml:space="preserve">  )</w:t>
+      </w:r>
+      <w:proofErr w:type="gramEnd"/>
+      <w:r>
+        <w:rPr>
+          <w:rFonts w:eastAsia="Times New Roman" w:cs="Times New Roman"/>
+          <w:kern w:val="0"/>
+          <w:sz w:val="24"/>
+          <w:szCs w:val="24"/>
+          <w:lang w:eastAsia="fr-FR"/>
+          <w14:ligatures w14:val="none"/>
+        </w:rPr>
+        <w:t xml:space="preserve">. Ensuite, copiez tous les fichiers de votre carte SD déjà existante sur votre nouvelle carte SD et le tour est joué. </w:t>
       </w:r>
       <w:r>
         <w:rPr>
@@ -7626,7 +9221,50 @@
           <w:lang w:eastAsia="fr-FR"/>
           <w14:ligatures w14:val="none"/>
         </w:rPr>
-        <w:t>Q : Au démarrage j’ai le message « No SD Card» avec un symbole de framboise ailée ?</w:t>
+        <w:t xml:space="preserve">Q : Au démarrage j’ai le message « No SD </w:t>
+      </w:r>
+      <w:proofErr w:type="spellStart"/>
+      <w:proofErr w:type="gramStart"/>
+      <w:r>
+        <w:rPr>
+          <w:rFonts w:eastAsia="Times New Roman" w:cs="Times New Roman"/>
+          <w:b/>
+          <w:bCs/>
+          <w:kern w:val="0"/>
+          <w:sz w:val="24"/>
+          <w:szCs w:val="24"/>
+          <w:lang w:eastAsia="fr-FR"/>
+          <w14:ligatures w14:val="none"/>
+        </w:rPr>
+        <w:t>Card</w:t>
+      </w:r>
+      <w:proofErr w:type="spellEnd"/>
+      <w:r>
+        <w:rPr>
+          <w:rFonts w:eastAsia="Times New Roman" w:cs="Times New Roman"/>
+          <w:b/>
+          <w:bCs/>
+          <w:kern w:val="0"/>
+          <w:sz w:val="24"/>
+          <w:szCs w:val="24"/>
+          <w:lang w:eastAsia="fr-FR"/>
+          <w14:ligatures w14:val="none"/>
+        </w:rPr>
+        <w:t>»</w:t>
+      </w:r>
+      <w:proofErr w:type="gramEnd"/>
+      <w:r>
+        <w:rPr>
+          <w:rFonts w:eastAsia="Times New Roman" w:cs="Times New Roman"/>
+          <w:b/>
+          <w:bCs/>
+          <w:kern w:val="0"/>
+          <w:sz w:val="24"/>
+          <w:szCs w:val="24"/>
+          <w:lang w:eastAsia="fr-FR"/>
+          <w14:ligatures w14:val="none"/>
+        </w:rPr>
+        <w:t xml:space="preserve"> avec un symbole de framboise ailée ?</w:t>
       </w:r>
     </w:p>
     <w:p>
@@ -7778,30 +9416,154 @@
           <w:lang w:eastAsia="fr-FR"/>
           <w14:ligatures w14:val="none"/>
         </w:rPr>
-        <w:t>Q : Ma console démarre automatiquement normalement et je n’ai plus le menu Hekate/ Ma console ne démarre pas du tout</w:t>
-      </w:r>
-    </w:p>
-    <w:p>
-      <w:pPr>
-        <w:rPr>
-          <w:rFonts w:eastAsia="Times New Roman" w:cs="Times New Roman"/>
-          <w:kern w:val="0"/>
-          <w:sz w:val="24"/>
-          <w:szCs w:val="24"/>
-          <w:lang w:eastAsia="fr-FR"/>
-          <w14:ligatures w14:val="none"/>
-        </w:rPr>
-      </w:pPr>
-      <w:r>
-        <w:rPr>
-          <w:rFonts w:eastAsia="Times New Roman" w:cs="Times New Roman"/>
-          <w:kern w:val="0"/>
-          <w:sz w:val="24"/>
-          <w:szCs w:val="24"/>
-          <w:lang w:eastAsia="fr-FR"/>
-          <w14:ligatures w14:val="none"/>
-        </w:rPr>
-        <w:t xml:space="preserve">R : Il y a eu un souci avec la puce Picofly, ce qui empêche l’injection du hack dans la console et empêche donc de démarrer la console dans sa version moddée. Recontactez moi ou allez voir un réparateur capable d’installer une puce Picofly. Mon installation offre 1 an de garantie gratuite en ce qui concerne l’installation de la puce qui n’a pas tenu. Passez donc me voir ! (Vos données de jeu ne sont pas perdues, ne vous inquiétez pas) </w:t>
+        <w:t xml:space="preserve">Q : Ma console démarre automatiquement normalement et je n’ai plus le menu </w:t>
+      </w:r>
+      <w:proofErr w:type="spellStart"/>
+      <w:r>
+        <w:rPr>
+          <w:rFonts w:eastAsia="Times New Roman" w:cs="Times New Roman"/>
+          <w:b/>
+          <w:bCs/>
+          <w:kern w:val="0"/>
+          <w:sz w:val="24"/>
+          <w:szCs w:val="24"/>
+          <w:lang w:eastAsia="fr-FR"/>
+          <w14:ligatures w14:val="none"/>
+        </w:rPr>
+        <w:t>Hekate</w:t>
+      </w:r>
+      <w:proofErr w:type="spellEnd"/>
+      <w:r>
+        <w:rPr>
+          <w:rFonts w:eastAsia="Times New Roman" w:cs="Times New Roman"/>
+          <w:b/>
+          <w:bCs/>
+          <w:kern w:val="0"/>
+          <w:sz w:val="24"/>
+          <w:szCs w:val="24"/>
+          <w:lang w:eastAsia="fr-FR"/>
+          <w14:ligatures w14:val="none"/>
+        </w:rPr>
+        <w:t>/ Ma console ne démarre pas du tout</w:t>
+      </w:r>
+    </w:p>
+    <w:p>
+      <w:pPr>
+        <w:rPr>
+          <w:rFonts w:eastAsia="Times New Roman" w:cs="Times New Roman"/>
+          <w:kern w:val="0"/>
+          <w:sz w:val="24"/>
+          <w:szCs w:val="24"/>
+          <w:lang w:eastAsia="fr-FR"/>
+          <w14:ligatures w14:val="none"/>
+        </w:rPr>
+      </w:pPr>
+      <w:r>
+        <w:rPr>
+          <w:rFonts w:eastAsia="Times New Roman" w:cs="Times New Roman"/>
+          <w:kern w:val="0"/>
+          <w:sz w:val="24"/>
+          <w:szCs w:val="24"/>
+          <w:lang w:eastAsia="fr-FR"/>
+          <w14:ligatures w14:val="none"/>
+        </w:rPr>
+        <w:t xml:space="preserve">R : Il y a eu un souci avec la puce </w:t>
+      </w:r>
+      <w:proofErr w:type="spellStart"/>
+      <w:r>
+        <w:rPr>
+          <w:rFonts w:eastAsia="Times New Roman" w:cs="Times New Roman"/>
+          <w:kern w:val="0"/>
+          <w:sz w:val="24"/>
+          <w:szCs w:val="24"/>
+          <w:lang w:eastAsia="fr-FR"/>
+          <w14:ligatures w14:val="none"/>
+        </w:rPr>
+        <w:t>Picofly</w:t>
+      </w:r>
+      <w:proofErr w:type="spellEnd"/>
+      <w:r>
+        <w:rPr>
+          <w:rFonts w:eastAsia="Times New Roman" w:cs="Times New Roman"/>
+          <w:kern w:val="0"/>
+          <w:sz w:val="24"/>
+          <w:szCs w:val="24"/>
+          <w:lang w:eastAsia="fr-FR"/>
+          <w14:ligatures w14:val="none"/>
+        </w:rPr>
+        <w:t xml:space="preserve">, ce qui empêche l’injection du hack dans la console et empêche donc de démarrer la console dans sa version </w:t>
+      </w:r>
+      <w:proofErr w:type="spellStart"/>
+      <w:r>
+        <w:rPr>
+          <w:rFonts w:eastAsia="Times New Roman" w:cs="Times New Roman"/>
+          <w:kern w:val="0"/>
+          <w:sz w:val="24"/>
+          <w:szCs w:val="24"/>
+          <w:lang w:eastAsia="fr-FR"/>
+          <w14:ligatures w14:val="none"/>
+        </w:rPr>
+        <w:t>moddée</w:t>
+      </w:r>
+      <w:proofErr w:type="spellEnd"/>
+      <w:r>
+        <w:rPr>
+          <w:rFonts w:eastAsia="Times New Roman" w:cs="Times New Roman"/>
+          <w:kern w:val="0"/>
+          <w:sz w:val="24"/>
+          <w:szCs w:val="24"/>
+          <w:lang w:eastAsia="fr-FR"/>
+          <w14:ligatures w14:val="none"/>
+        </w:rPr>
+        <w:t xml:space="preserve">. </w:t>
+      </w:r>
+      <w:proofErr w:type="gramStart"/>
+      <w:r>
+        <w:rPr>
+          <w:rFonts w:eastAsia="Times New Roman" w:cs="Times New Roman"/>
+          <w:kern w:val="0"/>
+          <w:sz w:val="24"/>
+          <w:szCs w:val="24"/>
+          <w:lang w:eastAsia="fr-FR"/>
+          <w14:ligatures w14:val="none"/>
+        </w:rPr>
+        <w:t>Recontactez moi</w:t>
+      </w:r>
+      <w:proofErr w:type="gramEnd"/>
+      <w:r>
+        <w:rPr>
+          <w:rFonts w:eastAsia="Times New Roman" w:cs="Times New Roman"/>
+          <w:kern w:val="0"/>
+          <w:sz w:val="24"/>
+          <w:szCs w:val="24"/>
+          <w:lang w:eastAsia="fr-FR"/>
+          <w14:ligatures w14:val="none"/>
+        </w:rPr>
+        <w:t xml:space="preserve"> ou allez voir un réparateur capable d’installer une puce </w:t>
+      </w:r>
+      <w:proofErr w:type="spellStart"/>
+      <w:r>
+        <w:rPr>
+          <w:rFonts w:eastAsia="Times New Roman" w:cs="Times New Roman"/>
+          <w:kern w:val="0"/>
+          <w:sz w:val="24"/>
+          <w:szCs w:val="24"/>
+          <w:lang w:eastAsia="fr-FR"/>
+          <w14:ligatures w14:val="none"/>
+        </w:rPr>
+        <w:t>Picofly</w:t>
+      </w:r>
+      <w:proofErr w:type="spellEnd"/>
+      <w:r>
+        <w:rPr>
+          <w:rFonts w:eastAsia="Times New Roman" w:cs="Times New Roman"/>
+          <w:kern w:val="0"/>
+          <w:sz w:val="24"/>
+          <w:szCs w:val="24"/>
+          <w:lang w:eastAsia="fr-FR"/>
+          <w14:ligatures w14:val="none"/>
+        </w:rPr>
+        <w:t xml:space="preserve">. Mon installation offre 1 an de garantie gratuite en ce qui concerne l’installation de la puce qui n’a pas tenu. Passez donc me voir ! (Vos données de jeu ne sont pas perdues, ne vous inquiétez pas) </w:t>
       </w:r>
     </w:p>
     <w:p>
@@ -7841,30 +9603,82 @@
           <w:lang w:eastAsia="fr-FR"/>
           <w14:ligatures w14:val="none"/>
         </w:rPr>
-        <w:t xml:space="preserve">Q : J’ai installé un jeu mais la console détecte le fichier comme corrompu ou affiche une erreur disant qu’il est impossible de lancer le jeu suite à une mise à jour. </w:t>
-      </w:r>
-    </w:p>
-    <w:p>
-      <w:pPr>
-        <w:rPr>
-          <w:rFonts w:eastAsia="Times New Roman" w:cs="Times New Roman"/>
-          <w:kern w:val="0"/>
-          <w:sz w:val="24"/>
-          <w:szCs w:val="24"/>
-          <w:lang w:eastAsia="fr-FR"/>
-          <w14:ligatures w14:val="none"/>
-        </w:rPr>
-      </w:pPr>
-      <w:r>
-        <w:rPr>
-          <w:rFonts w:eastAsia="Times New Roman" w:cs="Times New Roman"/>
-          <w:kern w:val="0"/>
-          <w:sz w:val="24"/>
-          <w:szCs w:val="24"/>
-          <w:lang w:eastAsia="fr-FR"/>
-          <w14:ligatures w14:val="none"/>
-        </w:rPr>
-        <w:t xml:space="preserve">R : Lorsque l’on met à jour le firmware de la console, tous les patchs permettant de lancer des jeux ne sont pas installés, et il peut y avoir des patchs manquants. Pour régler ce problème, la méthode la plus simple est de télécharger la dernière release sur ce site : </w:t>
+        <w:t xml:space="preserve">Q : J’ai installé un jeu mais la console détecte le fichier comme corrompu ou affiche une erreur disant qu’il est impossible de lancer le jeu </w:t>
+      </w:r>
+      <w:proofErr w:type="gramStart"/>
+      <w:r>
+        <w:rPr>
+          <w:rFonts w:eastAsia="Times New Roman" w:cs="Times New Roman"/>
+          <w:b/>
+          <w:bCs/>
+          <w:kern w:val="0"/>
+          <w:sz w:val="24"/>
+          <w:szCs w:val="24"/>
+          <w:lang w:eastAsia="fr-FR"/>
+          <w14:ligatures w14:val="none"/>
+        </w:rPr>
+        <w:t>suite à une</w:t>
+      </w:r>
+      <w:proofErr w:type="gramEnd"/>
+      <w:r>
+        <w:rPr>
+          <w:rFonts w:eastAsia="Times New Roman" w:cs="Times New Roman"/>
+          <w:b/>
+          <w:bCs/>
+          <w:kern w:val="0"/>
+          <w:sz w:val="24"/>
+          <w:szCs w:val="24"/>
+          <w:lang w:eastAsia="fr-FR"/>
+          <w14:ligatures w14:val="none"/>
+        </w:rPr>
+        <w:t xml:space="preserve"> mise à jour. </w:t>
+      </w:r>
+    </w:p>
+    <w:p>
+      <w:pPr>
+        <w:rPr>
+          <w:rFonts w:eastAsia="Times New Roman" w:cs="Times New Roman"/>
+          <w:kern w:val="0"/>
+          <w:sz w:val="24"/>
+          <w:szCs w:val="24"/>
+          <w:lang w:eastAsia="fr-FR"/>
+          <w14:ligatures w14:val="none"/>
+        </w:rPr>
+      </w:pPr>
+      <w:r>
+        <w:rPr>
+          <w:rFonts w:eastAsia="Times New Roman" w:cs="Times New Roman"/>
+          <w:kern w:val="0"/>
+          <w:sz w:val="24"/>
+          <w:szCs w:val="24"/>
+          <w:lang w:eastAsia="fr-FR"/>
+          <w14:ligatures w14:val="none"/>
+        </w:rPr>
+        <w:t xml:space="preserve">R : Lorsque l’on met à jour le </w:t>
+      </w:r>
+      <w:proofErr w:type="spellStart"/>
+      <w:r>
+        <w:rPr>
+          <w:rFonts w:eastAsia="Times New Roman" w:cs="Times New Roman"/>
+          <w:kern w:val="0"/>
+          <w:sz w:val="24"/>
+          <w:szCs w:val="24"/>
+          <w:lang w:eastAsia="fr-FR"/>
+          <w14:ligatures w14:val="none"/>
+        </w:rPr>
+        <w:t>firmware</w:t>
+      </w:r>
+      <w:proofErr w:type="spellEnd"/>
+      <w:r>
+        <w:rPr>
+          <w:rFonts w:eastAsia="Times New Roman" w:cs="Times New Roman"/>
+          <w:kern w:val="0"/>
+          <w:sz w:val="24"/>
+          <w:szCs w:val="24"/>
+          <w:lang w:eastAsia="fr-FR"/>
+          <w14:ligatures w14:val="none"/>
+        </w:rPr>
+        <w:t xml:space="preserve"> de la console, tous les patchs permettant de lancer des jeux ne sont pas installés, et il peut y avoir des patchs manquants. Pour régler ce problème, la méthode la plus simple est de télécharger la dernière release sur ce site : </w:t>
       </w:r>
       <w:hyperlink r:id="rId52" w:history="1">
         <w:r>
@@ -8239,7 +10053,35 @@
           <w:lang w:val="en-US" w:eastAsia="fr-FR"/>
           <w14:ligatures w14:val="none"/>
         </w:rPr>
-        <w:t xml:space="preserve"> Étape 1 : Ouvrir All-In-One Switch Updater</w:t>
+        <w:t xml:space="preserve"> Étape 1 : </w:t>
+      </w:r>
+      <w:proofErr w:type="spellStart"/>
+      <w:r>
+        <w:rPr>
+          <w:rFonts w:eastAsia="Times New Roman" w:cs="Times New Roman"/>
+          <w:b/>
+          <w:bCs/>
+          <w:kern w:val="0"/>
+          <w:sz w:val="24"/>
+          <w:szCs w:val="24"/>
+          <w:lang w:val="en-US" w:eastAsia="fr-FR"/>
+          <w14:ligatures w14:val="none"/>
+        </w:rPr>
+        <w:t>Ouvrir</w:t>
+      </w:r>
+      <w:proofErr w:type="spellEnd"/>
+      <w:r>
+        <w:rPr>
+          <w:rFonts w:eastAsia="Times New Roman" w:cs="Times New Roman"/>
+          <w:b/>
+          <w:bCs/>
+          <w:kern w:val="0"/>
+          <w:sz w:val="24"/>
+          <w:szCs w:val="24"/>
+          <w:lang w:val="en-US" w:eastAsia="fr-FR"/>
+          <w14:ligatures w14:val="none"/>
+        </w:rPr>
+        <w:t xml:space="preserve"> All-In-One Switch Updater</w:t>
       </w:r>
     </w:p>
     <w:p>
@@ -8268,6 +10110,7 @@
         </w:rPr>
         <w:t xml:space="preserve">Démarre ta console en </w:t>
       </w:r>
+      <w:proofErr w:type="spellStart"/>
       <w:r>
         <w:rPr>
           <w:rFonts w:eastAsia="Times New Roman" w:cs="Times New Roman"/>
@@ -8281,6 +10124,7 @@
         </w:rPr>
         <w:t>EmuMMC</w:t>
       </w:r>
+      <w:proofErr w:type="spellEnd"/>
     </w:p>
     <w:p>
       <w:pPr>
@@ -8836,8 +10680,23 @@
           <w:lang w:eastAsia="fr-FR"/>
           <w14:ligatures w14:val="none"/>
         </w:rPr>
-        <w:t xml:space="preserve"> Étape 3 : Mettre à jour Hekate</w:t>
-      </w:r>
+        <w:t xml:space="preserve"> Étape 3 : Mettre à jour </w:t>
+      </w:r>
+      <w:proofErr w:type="spellStart"/>
+      <w:r>
+        <w:rPr>
+          <w:rFonts w:eastAsia="Times New Roman" w:cs="Times New Roman"/>
+          <w:b/>
+          <w:bCs/>
+          <w:kern w:val="0"/>
+          <w:sz w:val="24"/>
+          <w:szCs w:val="24"/>
+          <w:lang w:eastAsia="fr-FR"/>
+          <w14:ligatures w14:val="none"/>
+        </w:rPr>
+        <w:t>Hekate</w:t>
+      </w:r>
+      <w:proofErr w:type="spellEnd"/>
     </w:p>
     <w:p>
       <w:pPr>
@@ -9052,7 +10911,31 @@
           <w:lang w:eastAsia="fr-FR"/>
           <w14:ligatures w14:val="none"/>
         </w:rPr>
-        <w:t xml:space="preserve"> Hekate est maintenant </w:t>
+        <w:t xml:space="preserve"> </w:t>
+      </w:r>
+      <w:proofErr w:type="spellStart"/>
+      <w:r>
+        <w:rPr>
+          <w:rFonts w:eastAsia="Times New Roman" w:cs="Times New Roman"/>
+          <w:kern w:val="0"/>
+          <w:sz w:val="24"/>
+          <w:szCs w:val="24"/>
+          <w:lang w:eastAsia="fr-FR"/>
+          <w14:ligatures w14:val="none"/>
+        </w:rPr>
+        <w:t>Hekate</w:t>
+      </w:r>
+      <w:proofErr w:type="spellEnd"/>
+      <w:r>
+        <w:rPr>
+          <w:rFonts w:eastAsia="Times New Roman" w:cs="Times New Roman"/>
+          <w:kern w:val="0"/>
+          <w:sz w:val="24"/>
+          <w:szCs w:val="24"/>
+          <w:lang w:eastAsia="fr-FR"/>
+          <w14:ligatures w14:val="none"/>
+        </w:rPr>
+        <w:t xml:space="preserve"> est maintenant </w:t>
       </w:r>
       <w:r>
         <w:rPr>
@@ -9139,7 +11022,63 @@
           <w:lang w:eastAsia="fr-FR"/>
           <w14:ligatures w14:val="none"/>
         </w:rPr>
-        <w:t xml:space="preserve"> Étape 4 : Mettre à jour le firmware (via Daybreak)</w:t>
+        <w:t xml:space="preserve"> Étape 4 : Mettre à jour le </w:t>
+      </w:r>
+      <w:proofErr w:type="spellStart"/>
+      <w:r>
+        <w:rPr>
+          <w:rFonts w:eastAsia="Times New Roman" w:cs="Times New Roman"/>
+          <w:b/>
+          <w:bCs/>
+          <w:kern w:val="0"/>
+          <w:sz w:val="24"/>
+          <w:szCs w:val="24"/>
+          <w:lang w:eastAsia="fr-FR"/>
+          <w14:ligatures w14:val="none"/>
+        </w:rPr>
+        <w:t>firmware</w:t>
+      </w:r>
+      <w:proofErr w:type="spellEnd"/>
+      <w:r>
+        <w:rPr>
+          <w:rFonts w:eastAsia="Times New Roman" w:cs="Times New Roman"/>
+          <w:b/>
+          <w:bCs/>
+          <w:kern w:val="0"/>
+          <w:sz w:val="24"/>
+          <w:szCs w:val="24"/>
+          <w:lang w:eastAsia="fr-FR"/>
+          <w14:ligatures w14:val="none"/>
+        </w:rPr>
+        <w:t xml:space="preserve"> (via </w:t>
+      </w:r>
+      <w:proofErr w:type="spellStart"/>
+      <w:r>
+        <w:rPr>
+          <w:rFonts w:eastAsia="Times New Roman" w:cs="Times New Roman"/>
+          <w:b/>
+          <w:bCs/>
+          <w:kern w:val="0"/>
+          <w:sz w:val="24"/>
+          <w:szCs w:val="24"/>
+          <w:lang w:eastAsia="fr-FR"/>
+          <w14:ligatures w14:val="none"/>
+        </w:rPr>
+        <w:t>Daybreak</w:t>
+      </w:r>
+      <w:proofErr w:type="spellEnd"/>
+      <w:r>
+        <w:rPr>
+          <w:rFonts w:eastAsia="Times New Roman" w:cs="Times New Roman"/>
+          <w:b/>
+          <w:bCs/>
+          <w:kern w:val="0"/>
+          <w:sz w:val="24"/>
+          <w:szCs w:val="24"/>
+          <w:lang w:eastAsia="fr-FR"/>
+          <w14:ligatures w14:val="none"/>
+        </w:rPr>
+        <w:t>)</w:t>
       </w:r>
     </w:p>
     <w:p>
@@ -9167,7 +11106,31 @@
           <w14:ligatures w14:val="none"/>
         </w:rPr>
         <w:lastRenderedPageBreak/>
-        <w:t xml:space="preserve">Dans AIO Updater, choisis </w:t>
+        <w:t xml:space="preserve">Dans AIO Updater, </w:t>
+      </w:r>
+      <w:proofErr w:type="spellStart"/>
+      <w:r>
+        <w:rPr>
+          <w:rFonts w:eastAsia="Times New Roman" w:cs="Times New Roman"/>
+          <w:kern w:val="0"/>
+          <w:sz w:val="24"/>
+          <w:szCs w:val="24"/>
+          <w:lang w:val="en-US" w:eastAsia="fr-FR"/>
+          <w14:ligatures w14:val="none"/>
+        </w:rPr>
+        <w:t>choisis</w:t>
+      </w:r>
+      <w:proofErr w:type="spellEnd"/>
+      <w:r>
+        <w:rPr>
+          <w:rFonts w:eastAsia="Times New Roman" w:cs="Times New Roman"/>
+          <w:kern w:val="0"/>
+          <w:sz w:val="24"/>
+          <w:szCs w:val="24"/>
+          <w:lang w:val="en-US" w:eastAsia="fr-FR"/>
+          <w14:ligatures w14:val="none"/>
+        </w:rPr>
+        <w:t xml:space="preserve"> </w:t>
       </w:r>
       <w:r>
         <w:rPr>
@@ -9313,6 +11276,7 @@
           <w14:ligatures w14:val="none"/>
         </w:rPr>
       </w:pPr>
+      <w:proofErr w:type="spellStart"/>
       <w:r>
         <w:rPr>
           <w:rFonts w:eastAsia="Times New Roman" w:cs="Times New Roman"/>
@@ -9322,19 +11286,31 @@
           <w:lang w:val="en-US" w:eastAsia="fr-FR"/>
           <w14:ligatures w14:val="none"/>
         </w:rPr>
-        <w:t xml:space="preserve">Choisis </w:t>
-      </w:r>
-      <w:r>
-        <w:rPr>
-          <w:rFonts w:eastAsia="Times New Roman" w:cs="Times New Roman"/>
-          <w:b/>
-          <w:bCs/>
+        <w:t>Choisis</w:t>
+      </w:r>
+      <w:proofErr w:type="spellEnd"/>
+      <w:r>
+        <w:rPr>
+          <w:rFonts w:eastAsia="Times New Roman" w:cs="Times New Roman"/>
           <w:kern w:val="0"/>
           <w:sz w:val="24"/>
           <w:szCs w:val="24"/>
           <w:lang w:val="en-US" w:eastAsia="fr-FR"/>
           <w14:ligatures w14:val="none"/>
         </w:rPr>
+        <w:t xml:space="preserve"> </w:t>
+      </w:r>
+      <w:r>
+        <w:rPr>
+          <w:rFonts w:eastAsia="Times New Roman" w:cs="Times New Roman"/>
+          <w:b/>
+          <w:bCs/>
+          <w:kern w:val="0"/>
+          <w:sz w:val="24"/>
+          <w:szCs w:val="24"/>
+          <w:lang w:val="en-US" w:eastAsia="fr-FR"/>
+          <w14:ligatures w14:val="none"/>
+        </w:rPr>
         <w:t>"Download to SD Card"</w:t>
       </w:r>
     </w:p>
@@ -9369,7 +11345,31 @@
           <w:lang w:eastAsia="fr-FR"/>
           <w14:ligatures w14:val="none"/>
         </w:rPr>
-        <w:t xml:space="preserve"> Cela télécharge un zip dans /firmware.</w:t>
+        <w:t xml:space="preserve"> Cela télécharge un zip dans /</w:t>
+      </w:r>
+      <w:proofErr w:type="spellStart"/>
+      <w:r>
+        <w:rPr>
+          <w:rFonts w:eastAsia="Times New Roman" w:cs="Times New Roman"/>
+          <w:kern w:val="0"/>
+          <w:sz w:val="24"/>
+          <w:szCs w:val="24"/>
+          <w:lang w:eastAsia="fr-FR"/>
+          <w14:ligatures w14:val="none"/>
+        </w:rPr>
+        <w:t>firmware</w:t>
+      </w:r>
+      <w:proofErr w:type="spellEnd"/>
+      <w:r>
+        <w:rPr>
+          <w:rFonts w:eastAsia="Times New Roman" w:cs="Times New Roman"/>
+          <w:kern w:val="0"/>
+          <w:sz w:val="24"/>
+          <w:szCs w:val="24"/>
+          <w:lang w:eastAsia="fr-FR"/>
+          <w14:ligatures w14:val="none"/>
+        </w:rPr>
+        <w:t>.</w:t>
       </w:r>
     </w:p>
     <w:p>
@@ -9449,6 +11449,7 @@
         </w:rPr>
         <w:t>5</w:t>
       </w:r>
+      <w:proofErr w:type="gramStart"/>
       <w:r>
         <w:rPr>
           <w:rFonts w:eastAsia="Times New Roman" w:cs="Times New Roman"/>
@@ -9473,8 +11474,65 @@
           <w:lang w:eastAsia="fr-FR"/>
           <w14:ligatures w14:val="none"/>
         </w:rPr>
-        <w:t>Installer les sigpatches et les syspatches</w:t>
-      </w:r>
+        <w:t>Installer</w:t>
+      </w:r>
+      <w:proofErr w:type="gramEnd"/>
+      <w:r>
+        <w:rPr>
+          <w:rFonts w:eastAsia="Times New Roman" w:cs="Times New Roman"/>
+          <w:b/>
+          <w:bCs/>
+          <w:kern w:val="0"/>
+          <w:sz w:val="24"/>
+          <w:szCs w:val="24"/>
+          <w:lang w:eastAsia="fr-FR"/>
+          <w14:ligatures w14:val="none"/>
+        </w:rPr>
+        <w:t xml:space="preserve"> les </w:t>
+      </w:r>
+      <w:proofErr w:type="spellStart"/>
+      <w:r>
+        <w:rPr>
+          <w:rFonts w:eastAsia="Times New Roman" w:cs="Times New Roman"/>
+          <w:b/>
+          <w:bCs/>
+          <w:kern w:val="0"/>
+          <w:sz w:val="24"/>
+          <w:szCs w:val="24"/>
+          <w:lang w:eastAsia="fr-FR"/>
+          <w14:ligatures w14:val="none"/>
+        </w:rPr>
+        <w:t>sigpatches</w:t>
+      </w:r>
+      <w:proofErr w:type="spellEnd"/>
+      <w:r>
+        <w:rPr>
+          <w:rFonts w:eastAsia="Times New Roman" w:cs="Times New Roman"/>
+          <w:b/>
+          <w:bCs/>
+          <w:kern w:val="0"/>
+          <w:sz w:val="24"/>
+          <w:szCs w:val="24"/>
+          <w:lang w:eastAsia="fr-FR"/>
+          <w14:ligatures w14:val="none"/>
+        </w:rPr>
+        <w:t xml:space="preserve"> et les </w:t>
+      </w:r>
+      <w:proofErr w:type="spellStart"/>
+      <w:r>
+        <w:rPr>
+          <w:rFonts w:eastAsia="Times New Roman" w:cs="Times New Roman"/>
+          <w:b/>
+          <w:bCs/>
+          <w:kern w:val="0"/>
+          <w:sz w:val="24"/>
+          <w:szCs w:val="24"/>
+          <w:lang w:eastAsia="fr-FR"/>
+          <w14:ligatures w14:val="none"/>
+        </w:rPr>
+        <w:t>syspatches</w:t>
+      </w:r>
+      <w:proofErr w:type="spellEnd"/>
     </w:p>
     <w:p>
       <w:pPr>
@@ -9704,8 +11762,51 @@
           <w:lang w:eastAsia="fr-FR"/>
           <w14:ligatures w14:val="none"/>
         </w:rPr>
-        <w:t xml:space="preserve"> : Installer le firmware avec Daybreak</w:t>
-      </w:r>
+        <w:t xml:space="preserve"> : Installer le </w:t>
+      </w:r>
+      <w:proofErr w:type="spellStart"/>
+      <w:r>
+        <w:rPr>
+          <w:rFonts w:eastAsia="Times New Roman" w:cs="Times New Roman"/>
+          <w:b/>
+          <w:bCs/>
+          <w:kern w:val="0"/>
+          <w:sz w:val="24"/>
+          <w:szCs w:val="24"/>
+          <w:lang w:eastAsia="fr-FR"/>
+          <w14:ligatures w14:val="none"/>
+        </w:rPr>
+        <w:t>firmware</w:t>
+      </w:r>
+      <w:proofErr w:type="spellEnd"/>
+      <w:r>
+        <w:rPr>
+          <w:rFonts w:eastAsia="Times New Roman" w:cs="Times New Roman"/>
+          <w:b/>
+          <w:bCs/>
+          <w:kern w:val="0"/>
+          <w:sz w:val="24"/>
+          <w:szCs w:val="24"/>
+          <w:lang w:eastAsia="fr-FR"/>
+          <w14:ligatures w14:val="none"/>
+        </w:rPr>
+        <w:t xml:space="preserve"> avec </w:t>
+      </w:r>
+      <w:proofErr w:type="spellStart"/>
+      <w:r>
+        <w:rPr>
+          <w:rFonts w:eastAsia="Times New Roman" w:cs="Times New Roman"/>
+          <w:b/>
+          <w:bCs/>
+          <w:kern w:val="0"/>
+          <w:sz w:val="24"/>
+          <w:szCs w:val="24"/>
+          <w:lang w:eastAsia="fr-FR"/>
+          <w14:ligatures w14:val="none"/>
+        </w:rPr>
+        <w:t>Daybreak</w:t>
+      </w:r>
+      <w:proofErr w:type="spellEnd"/>
     </w:p>
     <w:p>
       <w:pPr>
@@ -9733,6 +11834,7 @@
         </w:rPr>
         <w:t xml:space="preserve">Retourne au menu homebrew et lance </w:t>
       </w:r>
+      <w:proofErr w:type="spellStart"/>
       <w:r>
         <w:rPr>
           <w:rFonts w:eastAsia="Times New Roman" w:cs="Times New Roman"/>
@@ -9746,6 +11848,7 @@
         </w:rPr>
         <w:t>Daybreak</w:t>
       </w:r>
+      <w:proofErr w:type="spellEnd"/>
     </w:p>
     <w:p>
       <w:pPr>
@@ -9762,16 +11865,53 @@
           <w14:ligatures w14:val="none"/>
         </w:rPr>
       </w:pPr>
-      <w:r>
-        <w:rPr>
-          <w:rFonts w:eastAsia="Times New Roman" w:cs="Times New Roman"/>
-          <w:kern w:val="0"/>
-          <w:sz w:val="24"/>
-          <w:szCs w:val="24"/>
-          <w:lang w:eastAsia="fr-FR"/>
-          <w14:ligatures w14:val="none"/>
-        </w:rPr>
-        <w:t>Choisis le dossier /firmware/&lt;version&gt;</w:t>
+      <w:proofErr w:type="gramStart"/>
+      <w:r>
+        <w:rPr>
+          <w:rFonts w:eastAsia="Times New Roman" w:cs="Times New Roman"/>
+          <w:kern w:val="0"/>
+          <w:sz w:val="24"/>
+          <w:szCs w:val="24"/>
+          <w:lang w:eastAsia="fr-FR"/>
+          <w14:ligatures w14:val="none"/>
+        </w:rPr>
+        <w:t>Choisis le</w:t>
+      </w:r>
+      <w:proofErr w:type="gramEnd"/>
+      <w:r>
+        <w:rPr>
+          <w:rFonts w:eastAsia="Times New Roman" w:cs="Times New Roman"/>
+          <w:kern w:val="0"/>
+          <w:sz w:val="24"/>
+          <w:szCs w:val="24"/>
+          <w:lang w:eastAsia="fr-FR"/>
+          <w14:ligatures w14:val="none"/>
+        </w:rPr>
+        <w:t xml:space="preserve"> dossier /</w:t>
+      </w:r>
+      <w:proofErr w:type="spellStart"/>
+      <w:r>
+        <w:rPr>
+          <w:rFonts w:eastAsia="Times New Roman" w:cs="Times New Roman"/>
+          <w:kern w:val="0"/>
+          <w:sz w:val="24"/>
+          <w:szCs w:val="24"/>
+          <w:lang w:eastAsia="fr-FR"/>
+          <w14:ligatures w14:val="none"/>
+        </w:rPr>
+        <w:t>firmware</w:t>
+      </w:r>
+      <w:proofErr w:type="spellEnd"/>
+      <w:r>
+        <w:rPr>
+          <w:rFonts w:eastAsia="Times New Roman" w:cs="Times New Roman"/>
+          <w:kern w:val="0"/>
+          <w:sz w:val="24"/>
+          <w:szCs w:val="24"/>
+          <w:lang w:eastAsia="fr-FR"/>
+          <w14:ligatures w14:val="none"/>
+        </w:rPr>
+        <w:t>/&lt;version&gt;</w:t>
       </w:r>
     </w:p>
     <w:p>
@@ -9811,7 +11951,35 @@
           <w:lang w:eastAsia="fr-FR"/>
           <w14:ligatures w14:val="none"/>
         </w:rPr>
-        <w:t>"Install (FAT32 + exFAT support)"</w:t>
+        <w:t xml:space="preserve">"Install (FAT32 + </w:t>
+      </w:r>
+      <w:proofErr w:type="spellStart"/>
+      <w:r>
+        <w:rPr>
+          <w:rFonts w:eastAsia="Times New Roman" w:cs="Times New Roman"/>
+          <w:b/>
+          <w:bCs/>
+          <w:kern w:val="0"/>
+          <w:sz w:val="24"/>
+          <w:szCs w:val="24"/>
+          <w:lang w:eastAsia="fr-FR"/>
+          <w14:ligatures w14:val="none"/>
+        </w:rPr>
+        <w:t>exFAT</w:t>
+      </w:r>
+      <w:proofErr w:type="spellEnd"/>
+      <w:r>
+        <w:rPr>
+          <w:rFonts w:eastAsia="Times New Roman" w:cs="Times New Roman"/>
+          <w:b/>
+          <w:bCs/>
+          <w:kern w:val="0"/>
+          <w:sz w:val="24"/>
+          <w:szCs w:val="24"/>
+          <w:lang w:eastAsia="fr-FR"/>
+          <w14:ligatures w14:val="none"/>
+        </w:rPr>
+        <w:t xml:space="preserve"> support)"</w:t>
       </w:r>
     </w:p>
     <w:p>
@@ -9838,8 +12006,21 @@
           <w:lang w:eastAsia="fr-FR"/>
           <w14:ligatures w14:val="none"/>
         </w:rPr>
-        <w:t>Confirme → installation du firmware</w:t>
-      </w:r>
+        <w:t xml:space="preserve">Confirme → installation du </w:t>
+      </w:r>
+      <w:proofErr w:type="spellStart"/>
+      <w:r>
+        <w:rPr>
+          <w:rFonts w:eastAsia="Times New Roman" w:cs="Times New Roman"/>
+          <w:kern w:val="0"/>
+          <w:sz w:val="24"/>
+          <w:szCs w:val="24"/>
+          <w:lang w:eastAsia="fr-FR"/>
+          <w14:ligatures w14:val="none"/>
+        </w:rPr>
+        <w:t>firmware</w:t>
+      </w:r>
+      <w:proofErr w:type="spellEnd"/>
     </w:p>
     <w:p>
       <w:pPr>
@@ -9890,8 +12071,21 @@
           <w:lang w:eastAsia="fr-FR"/>
           <w14:ligatures w14:val="none"/>
         </w:rPr>
-        <w:t xml:space="preserve"> et redémarre en EmuMMC</w:t>
-      </w:r>
+        <w:t xml:space="preserve"> et redémarre en </w:t>
+      </w:r>
+      <w:proofErr w:type="spellStart"/>
+      <w:r>
+        <w:rPr>
+          <w:rFonts w:eastAsia="Times New Roman" w:cs="Times New Roman"/>
+          <w:kern w:val="0"/>
+          <w:sz w:val="24"/>
+          <w:szCs w:val="24"/>
+          <w:lang w:eastAsia="fr-FR"/>
+          <w14:ligatures w14:val="none"/>
+        </w:rPr>
+        <w:t>EmuMMC</w:t>
+      </w:r>
+      <w:proofErr w:type="spellEnd"/>
     </w:p>
     <w:p>
       <w:pPr>
@@ -9924,7 +12118,31 @@
           <w:lang w:eastAsia="fr-FR"/>
           <w14:ligatures w14:val="none"/>
         </w:rPr>
-        <w:t xml:space="preserve"> Ton firmware est maintenant mis </w:t>
+        <w:t xml:space="preserve"> Ton </w:t>
+      </w:r>
+      <w:proofErr w:type="spellStart"/>
+      <w:r>
+        <w:rPr>
+          <w:rFonts w:eastAsia="Times New Roman" w:cs="Times New Roman"/>
+          <w:kern w:val="0"/>
+          <w:sz w:val="24"/>
+          <w:szCs w:val="24"/>
+          <w:lang w:eastAsia="fr-FR"/>
+          <w14:ligatures w14:val="none"/>
+        </w:rPr>
+        <w:t>firmware</w:t>
+      </w:r>
+      <w:proofErr w:type="spellEnd"/>
+      <w:r>
+        <w:rPr>
+          <w:rFonts w:eastAsia="Times New Roman" w:cs="Times New Roman"/>
+          <w:kern w:val="0"/>
+          <w:sz w:val="24"/>
+          <w:szCs w:val="24"/>
+          <w:lang w:eastAsia="fr-FR"/>
+          <w14:ligatures w14:val="none"/>
+        </w:rPr>
+        <w:t xml:space="preserve"> est maintenant mis </w:t>
       </w:r>
       <w:r>
         <w:rPr>
@@ -10167,7 +12385,19 @@
           <w:lang w:eastAsia="fr-FR"/>
           <w14:ligatures w14:val="none"/>
         </w:rPr>
-        <w:t xml:space="preserve"> Toujours attendre que Atmosph</w:t>
+        <w:t xml:space="preserve"> Toujours attendre </w:t>
+      </w:r>
+      <w:proofErr w:type="gramStart"/>
+      <w:r>
+        <w:rPr>
+          <w:rFonts w:eastAsia="Times New Roman" w:cs="Times New Roman"/>
+          <w:kern w:val="0"/>
+          <w:sz w:val="24"/>
+          <w:szCs w:val="24"/>
+          <w:lang w:eastAsia="fr-FR"/>
+          <w14:ligatures w14:val="none"/>
+        </w:rPr>
+        <w:t>que Atmosph</w:t>
       </w:r>
       <w:r>
         <w:rPr>
@@ -10189,21 +12419,48 @@
           <w:lang w:eastAsia="fr-FR"/>
           <w14:ligatures w14:val="none"/>
         </w:rPr>
-        <w:t xml:space="preserve">re </w:t>
-      </w:r>
-      <w:r>
-        <w:rPr>
-          <w:rFonts w:eastAsia="Times New Roman" w:cs="Times New Roman"/>
-          <w:b/>
-          <w:bCs/>
-          <w:kern w:val="0"/>
-          <w:sz w:val="24"/>
-          <w:szCs w:val="24"/>
-          <w:lang w:eastAsia="fr-FR"/>
-          <w14:ligatures w14:val="none"/>
-        </w:rPr>
-        <w:t>supporte la version de firmware</w:t>
-      </w:r>
+        <w:t>re</w:t>
+      </w:r>
+      <w:proofErr w:type="gramEnd"/>
+      <w:r>
+        <w:rPr>
+          <w:rFonts w:eastAsia="Times New Roman" w:cs="Times New Roman"/>
+          <w:kern w:val="0"/>
+          <w:sz w:val="24"/>
+          <w:szCs w:val="24"/>
+          <w:lang w:eastAsia="fr-FR"/>
+          <w14:ligatures w14:val="none"/>
+        </w:rPr>
+        <w:t xml:space="preserve"> </w:t>
+      </w:r>
+      <w:r>
+        <w:rPr>
+          <w:rFonts w:eastAsia="Times New Roman" w:cs="Times New Roman"/>
+          <w:b/>
+          <w:bCs/>
+          <w:kern w:val="0"/>
+          <w:sz w:val="24"/>
+          <w:szCs w:val="24"/>
+          <w:lang w:eastAsia="fr-FR"/>
+          <w14:ligatures w14:val="none"/>
+        </w:rPr>
+        <w:t xml:space="preserve">supporte la version de </w:t>
+      </w:r>
+      <w:proofErr w:type="spellStart"/>
+      <w:r>
+        <w:rPr>
+          <w:rFonts w:eastAsia="Times New Roman" w:cs="Times New Roman"/>
+          <w:b/>
+          <w:bCs/>
+          <w:kern w:val="0"/>
+          <w:sz w:val="24"/>
+          <w:szCs w:val="24"/>
+          <w:lang w:eastAsia="fr-FR"/>
+          <w14:ligatures w14:val="none"/>
+        </w:rPr>
+        <w:t>firmware</w:t>
+      </w:r>
+      <w:proofErr w:type="spellEnd"/>
       <w:r>
         <w:rPr>
           <w:rFonts w:eastAsia="Times New Roman" w:cs="Times New Roman"/>
@@ -10355,7 +12612,23 @@
     </w:p>
     <w:p>
       <w:r>
-        <w:t xml:space="preserve">Symptôme :  La console démarre sans le menu Hekate, et sans les jeux que j’ai téléchargé. </w:t>
+        <w:t xml:space="preserve">Symptôme :  La console démarre sans le menu </w:t>
+      </w:r>
+      <w:proofErr w:type="spellStart"/>
+      <w:r>
+        <w:t>Hekate</w:t>
+      </w:r>
+      <w:proofErr w:type="spellEnd"/>
+      <w:r>
+        <w:t xml:space="preserve">, et sans les jeux que j’ai </w:t>
+      </w:r>
+      <w:proofErr w:type="gramStart"/>
+      <w:r>
+        <w:t>téléchargé</w:t>
+      </w:r>
+      <w:proofErr w:type="gramEnd"/>
+      <w:r>
+        <w:t xml:space="preserve">. </w:t>
       </w:r>
     </w:p>
     <w:p>
@@ -10396,7 +12669,23 @@
         </w:numPr>
       </w:pPr>
       <w:r>
-        <w:t xml:space="preserve">La console ne démarre pas du tout. Essayez de charger la console  une heure. Si après 1h elle ne démarre toujours pas, c’est qu’il y  a un souci avec la puce de hack. Il faut un réparateur pour résoudre le problème. </w:t>
+        <w:t xml:space="preserve">La console ne démarre pas du tout. Essayez de charger la </w:t>
+      </w:r>
+      <w:proofErr w:type="gramStart"/>
+      <w:r>
+        <w:t>console  une</w:t>
+      </w:r>
+      <w:proofErr w:type="gramEnd"/>
+      <w:r>
+        <w:t xml:space="preserve"> heure. Si après 1h elle ne démarre toujours pas, c’est qu’il </w:t>
+      </w:r>
+      <w:proofErr w:type="gramStart"/>
+      <w:r>
+        <w:t>y  a</w:t>
+      </w:r>
+      <w:proofErr w:type="gramEnd"/>
+      <w:r>
+        <w:t xml:space="preserve"> un souci avec la puce de hack. Il faut un réparateur pour résoudre le problème. </w:t>
       </w:r>
     </w:p>
     <w:p>
@@ -10408,10 +12697,42 @@
         </w:numPr>
       </w:pPr>
       <w:r>
-        <w:t>La console démarre sans carte SD sur un écran avec marqué « No sd card found »</w:t>
-      </w:r>
-      <w:r>
-        <w:t xml:space="preserve"> : la puce de hack marche encore, le souci vient du firmware sur la carte SD. </w:t>
+        <w:t xml:space="preserve">La console démarre sans carte SD sur un écran avec marqué « No </w:t>
+      </w:r>
+      <w:proofErr w:type="spellStart"/>
+      <w:r>
+        <w:t>sd</w:t>
+      </w:r>
+      <w:proofErr w:type="spellEnd"/>
+      <w:r>
+        <w:t xml:space="preserve"> </w:t>
+      </w:r>
+      <w:proofErr w:type="spellStart"/>
+      <w:r>
+        <w:t>card</w:t>
+      </w:r>
+      <w:proofErr w:type="spellEnd"/>
+      <w:r>
+        <w:t xml:space="preserve"> </w:t>
+      </w:r>
+      <w:proofErr w:type="spellStart"/>
+      <w:r>
+        <w:t>found</w:t>
+      </w:r>
+      <w:proofErr w:type="spellEnd"/>
+      <w:r>
+        <w:t> »</w:t>
+      </w:r>
+      <w:r>
+        <w:t xml:space="preserve"> : la puce de hack marche encore, le souci vient du </w:t>
+      </w:r>
+      <w:proofErr w:type="spellStart"/>
+      <w:r>
+        <w:t>firmware</w:t>
+      </w:r>
+      <w:proofErr w:type="spellEnd"/>
+      <w:r>
+        <w:t xml:space="preserve"> sur la carte SD. </w:t>
       </w:r>
     </w:p>
     <w:p>
@@ -10423,7 +12744,23 @@
         </w:numPr>
       </w:pPr>
       <w:r>
-        <w:t>Remettre la carte SD et démarrer la console en mode Hekate ( pour cela voir la section « Qu’est ce que sont les différents modes de boot »)</w:t>
+        <w:t xml:space="preserve">Remettre la carte SD et démarrer la console en mode </w:t>
+      </w:r>
+      <w:proofErr w:type="spellStart"/>
+      <w:r>
+        <w:t>Hekate</w:t>
+      </w:r>
+      <w:proofErr w:type="spellEnd"/>
+      <w:r>
+        <w:t xml:space="preserve"> </w:t>
+      </w:r>
+      <w:proofErr w:type="gramStart"/>
+      <w:r>
+        <w:t>( pour</w:t>
+      </w:r>
+      <w:proofErr w:type="gramEnd"/>
+      <w:r>
+        <w:t xml:space="preserve"> cela voir la section « Qu’est ce que sont les différents modes de boot »)</w:t>
       </w:r>
     </w:p>
     <w:p>
@@ -10435,12 +12772,49 @@
         </w:numPr>
       </w:pPr>
       <w:r>
-        <w:t xml:space="preserve">Si la console démarre Hekate, tentez de lancer EmuMMC depuis </w:t>
+        <w:t xml:space="preserve">Si la console démarre </w:t>
+      </w:r>
+      <w:proofErr w:type="spellStart"/>
+      <w:r>
+        <w:t>Hekate</w:t>
+      </w:r>
+      <w:proofErr w:type="spellEnd"/>
+      <w:r>
+        <w:t xml:space="preserve">, tentez de lancer </w:t>
+      </w:r>
+      <w:proofErr w:type="spellStart"/>
+      <w:r>
+        <w:t>EmuMMC</w:t>
+      </w:r>
+      <w:proofErr w:type="spellEnd"/>
+      <w:r>
+        <w:t xml:space="preserve"> depuis </w:t>
       </w:r>
       <w:r>
         <w:br/>
-        <w:t>Launch -&gt; EmuMMC ( tout à droite )</w:t>
-      </w:r>
+        <w:t xml:space="preserve">Launch -&gt; </w:t>
+      </w:r>
+      <w:proofErr w:type="spellStart"/>
+      <w:r>
+        <w:t>EmuMMC</w:t>
+      </w:r>
+      <w:proofErr w:type="spellEnd"/>
+      <w:r>
+        <w:t xml:space="preserve"> </w:t>
+      </w:r>
+      <w:proofErr w:type="gramStart"/>
+      <w:r>
+        <w:t>( tout</w:t>
+      </w:r>
+      <w:proofErr w:type="gramEnd"/>
+      <w:r>
+        <w:t xml:space="preserve"> à </w:t>
+      </w:r>
+      <w:proofErr w:type="gramStart"/>
+      <w:r>
+        <w:t>droite )</w:t>
+      </w:r>
+      <w:proofErr w:type="gramEnd"/>
       <w:r>
         <w:t>. Patientez quelques minutes. Si cela échoue, allez consulter la section « Installer le HATS pack », il est fort probable que la console ait corrompu son dossier « Atmosphère »</w:t>
       </w:r>
@@ -10615,27 +12989,27 @@
 <w:numbering xmlns:wpc="http://schemas.microsoft.com/office/word/2010/wordprocessingCanvas" xmlns:cx="http://schemas.microsoft.com/office/drawing/2014/chartex" xmlns:cx1="http://schemas.microsoft.com/office/drawing/2015/9/8/chartex" xmlns:cx2="http://schemas.microsoft.com/office/drawing/2015/10/21/chartex" xmlns:cx3="http://schemas.microsoft.com/office/drawing/2016/5/9/chartex" xmlns:cx4="http://schemas.microsoft.com/office/drawing/2016/5/10/chartex" xmlns:cx5="http://schemas.microsoft.com/office/drawing/2016/5/11/chartex" xmlns:cx6="http://schemas.microsoft.com/office/drawing/2016/5/12/chartex" xmlns:cx7="http://schemas.microsoft.com/office/drawing/2016/5/13/chartex" xmlns:cx8="http://schemas.microsoft.com/office/drawing/2016/5/14/chartex" xmlns:mc="http://schemas.openxmlformats.org/markup-compatibility/2006" xmlns:aink="http://schemas.microsoft.com/office/drawing/2016/ink" xmlns:am3d="http://schemas.microsoft.com/office/drawing/2017/model3d" xmlns:o="urn:schemas-microsoft-com:office:office" xmlns:oel="http://schemas.microsoft.com/office/2019/extlst" xmlns:r="http://schemas.openxmlformats.org/officeDocument/2006/relationships" xmlns:m="http://schemas.openxmlformats.org/officeDocument/2006/math" xmlns:v="urn:schemas-microsoft-com:vml" xmlns:wp14="http://schemas.microsoft.com/office/word/2010/wordprocessingDrawing" xmlns:wp="http://schemas.openxmlformats.org/drawingml/2006/wordprocessingDrawing" xmlns:w10="urn:schemas-microsoft-com:office:word" xmlns:w="http://schemas.openxmlformats.org/wordprocessingml/2006/main" xmlns:w14="http://schemas.microsoft.com/office/word/2010/wordml" xmlns:w15="http://schemas.microsoft.com/office/word/2012/wordml" xmlns:w16cex="http://schemas.microsoft.com/office/word/2018/wordml/cex" xmlns:w16cid="http://schemas.microsoft.com/office/word/2016/wordml/cid" xmlns:w16="http://schemas.microsoft.com/office/word/2018/wordml" xmlns:w16du="http://schemas.microsoft.com/office/word/2023/wordml/word16du" xmlns:w16sdtdh="http://schemas.microsoft.com/office/word/2020/wordml/sdtdatahash" xmlns:w16sdtfl="http://schemas.microsoft.com/office/word/2024/wordml/sdtformatlock" xmlns:w16se="http://schemas.microsoft.com/office/word/2015/wordml/symex" xmlns:wpg="http://schemas.microsoft.com/office/word/2010/wordprocessingGroup" xmlns:wpi="http://schemas.microsoft.com/office/word/2010/wordprocessingInk" xmlns:wne="http://schemas.microsoft.com/office/word/2006/wordml" xmlns:wps="http://schemas.microsoft.com/office/word/2010/wordprocessingShape" mc:Ignorable="w14 w15 w16se w16cid w16 w16cex w16sdtdh w16sdtfl w16du wp14">
   <w:numPicBullet w:numPicBulletId="0">
     <w:pict>
-      <v:rect id="_x0000_i1051" style="width:0;height:1.5pt" o:hralign="center" o:bullet="t" o:hrstd="t" o:hr="t" fillcolor="#a0a0a0" stroked="f"/>
+      <v:rect id="_x0000_i1086" style="width:0;height:1.5pt" o:hralign="center" o:bullet="t" o:hrstd="t" o:hr="t" fillcolor="#a0a0a0" stroked="f"/>
     </w:pict>
   </w:numPicBullet>
   <w:numPicBullet w:numPicBulletId="1">
     <w:pict>
-      <v:rect id="_x0000_i1052" style="width:0;height:1.5pt" o:hralign="center" o:bullet="t" o:hrstd="t" o:hr="t" fillcolor="#a0a0a0" stroked="f"/>
+      <v:rect id="_x0000_i1087" style="width:0;height:1.5pt" o:hralign="center" o:bullet="t" o:hrstd="t" o:hr="t" fillcolor="#a0a0a0" stroked="f"/>
     </w:pict>
   </w:numPicBullet>
   <w:numPicBullet w:numPicBulletId="2">
     <w:pict>
-      <v:rect id="_x0000_i1053" style="width:0;height:1.5pt" o:hralign="center" o:bullet="t" o:hrstd="t" o:hr="t" fillcolor="#a0a0a0" stroked="f"/>
+      <v:rect id="_x0000_i1088" style="width:0;height:1.5pt" o:hralign="center" o:bullet="t" o:hrstd="t" o:hr="t" fillcolor="#a0a0a0" stroked="f"/>
     </w:pict>
   </w:numPicBullet>
   <w:numPicBullet w:numPicBulletId="3">
     <w:pict>
-      <v:rect id="_x0000_i1054" style="width:0;height:1.5pt" o:hralign="center" o:bullet="t" o:hrstd="t" o:hr="t" fillcolor="#a0a0a0" stroked="f"/>
+      <v:rect id="_x0000_i1089" style="width:0;height:1.5pt" o:hralign="center" o:bullet="t" o:hrstd="t" o:hr="t" fillcolor="#a0a0a0" stroked="f"/>
     </w:pict>
   </w:numPicBullet>
   <w:numPicBullet w:numPicBulletId="4">
     <w:pict>
-      <v:rect id="_x0000_i1055" style="width:0;height:1.5pt" o:hralign="center" o:bullet="t" o:hrstd="t" o:hr="t" fillcolor="#a0a0a0" stroked="f"/>
+      <v:rect id="_x0000_i1090" style="width:0;height:1.5pt" o:hralign="center" o:bullet="t" o:hrstd="t" o:hr="t" fillcolor="#a0a0a0" stroked="f"/>
     </w:pict>
   </w:numPicBullet>
   <w:abstractNum w:abstractNumId="0" w15:restartNumberingAfterBreak="0">

</xml_diff>